<commit_message>
D5: expediente, jurisdicciones de alto riesgo, flujo de alertas, continuidad PEP y seguimiento de observaciones
Complementa los cuatro manuales (INM v5, NOT v3, COR v2, PROF v2) tras verificarlos contra la lista de 14 apartados:
- Integración, cotejo, verificación y actualización del expediente por tipo de cliente (Arts. 12, 21 y 22 RCG), incl. fideicomisos y estructuras sin personalidad
- Política de países y jurisdicciones de alto riesgo: UIF, régimen fiscal preferente, GAFI/GAFILAT (Arts. 23 Bis 4 y 41 fr. V)
- Procedimiento interno de análisis y dictamen de alertas con etapas y plazos; el Aviso de 24 h no se difiere
- Continuidad de la relación con PEP de riesgo alto detectados con posterioridad (23 Ter 5)
- Plan de seguimiento de observaciones de auditoría y supervisión (Art. 42)
- Anexo A actualizado

Co-Authored-By: Claude Opus 5.5 <noreply@anthropic.com>
Claude-Session: https://claude.ai/code/session_016XRcxhgbTkdaWeFCQN6v1v
</commit_message>
<xml_diff>
--- a/plantillas/corredores/D5-COR_Manual_Cumplimiento_PLD_v2.docx
+++ b/plantillas/corredores/D5-COR_Manual_Cumplimiento_PLD_v2.docx
@@ -1714,6 +1714,634 @@
           <w:szCs w:val="20"/>
         </w:rPr>
         <w:t xml:space="preserve">El fundamento del criterio "sin umbral" de los incisos b), c) y d) y de la no acumulación se desarrolla en el Dictamen de Sujeción Normativa (D1-COR, sección 2.3).</w:t>
+      </w:r>
+    </w:p>
+    <w:p>
+      <w:pPr>
+        <w:keepNext/>
+        <w:spacing w:after="60" w:before="120"/>
+      </w:pPr>
+      <w:r>
+        <w:rPr>
+          <w:rFonts w:ascii="Calibri" w:cs="Calibri" w:eastAsia="Calibri" w:hAnsi="Calibri"/>
+          <w:b/>
+          <w:bCs/>
+          <w:color w:val="0A1628"/>
+          <w:sz w:val="19"/>
+          <w:szCs w:val="19"/>
+        </w:rPr>
+        <w:t xml:space="preserve">4.2 Integración, cotejo, verificación y actualización del expediente (Arts. 12, 21 y 22 RCG)</w:t>
+      </w:r>
+    </w:p>
+    <w:p>
+      <w:pPr>
+        <w:spacing w:after="110"/>
+      </w:pPr>
+      <w:r>
+        <w:rPr>
+          <w:rFonts w:ascii="Calibri" w:cs="Calibri" w:eastAsia="Calibri" w:hAnsi="Calibri"/>
+          <w:sz w:val="20"/>
+          <w:szCs w:val="20"/>
+        </w:rPr>
+        <w:t xml:space="preserve">El expediente único de identificación se integra antes del acto u operación o, a más tardar, al establecer la Relación de negocios, con los datos y documentos del Anexo de las RCG que corresponda al tipo de Cliente o Usuaria (Art. 12):</w:t>
+      </w:r>
+    </w:p>
+    <w:tbl>
+      <w:tblPr>
+        <w:tblW w:type="dxa" w:w="9500"/>
+        <w:tblBorders>
+          <w:top w:val="single" w:color="auto" w:sz="4"/>
+          <w:left w:val="single" w:color="auto" w:sz="4"/>
+          <w:bottom w:val="single" w:color="auto" w:sz="4"/>
+          <w:right w:val="single" w:color="auto" w:sz="4"/>
+          <w:insideH w:val="single" w:color="auto" w:sz="4"/>
+          <w:insideV w:val="single" w:color="auto" w:sz="4"/>
+        </w:tblBorders>
+        <w:tblLayout w:type="fixed"/>
+      </w:tblPr>
+      <w:tblGrid>
+        <w:gridCol w:w="5200"/>
+        <w:gridCol w:w="4300"/>
+      </w:tblGrid>
+      <w:tr>
+        <w:trPr>
+          <w:tblHeader/>
+        </w:trPr>
+        <w:tc>
+          <w:tcPr>
+            <w:tcW w:type="dxa" w:w="5200"/>
+            <w:shd w:fill="1F3864" w:val="clear"/>
+            <w:tcMar>
+              <w:top w:type="dxa" w:w="60"/>
+              <w:left w:type="dxa" w:w="100"/>
+              <w:bottom w:type="dxa" w:w="60"/>
+              <w:right w:type="dxa" w:w="100"/>
+            </w:tcMar>
+          </w:tcPr>
+          <w:p>
+            <w:pPr>
+              <w:spacing w:after="0"/>
+            </w:pPr>
+            <w:r>
+              <w:rPr>
+                <w:rFonts w:ascii="Calibri" w:cs="Calibri" w:eastAsia="Calibri" w:hAnsi="Calibri"/>
+                <w:b/>
+                <w:bCs/>
+                <w:color w:val="FFFFFF"/>
+                <w:sz w:val="18"/>
+                <w:szCs w:val="18"/>
+              </w:rPr>
+              <w:t xml:space="preserve">Tipo de Cliente o Usuaria</w:t>
+            </w:r>
+          </w:p>
+        </w:tc>
+        <w:tc>
+          <w:tcPr>
+            <w:tcW w:type="dxa" w:w="4300"/>
+            <w:shd w:fill="1F3864" w:val="clear"/>
+            <w:tcMar>
+              <w:top w:type="dxa" w:w="60"/>
+              <w:left w:type="dxa" w:w="100"/>
+              <w:bottom w:type="dxa" w:w="60"/>
+              <w:right w:type="dxa" w:w="100"/>
+            </w:tcMar>
+          </w:tcPr>
+          <w:p>
+            <w:pPr>
+              <w:spacing w:after="0"/>
+            </w:pPr>
+            <w:r>
+              <w:rPr>
+                <w:rFonts w:ascii="Calibri" w:cs="Calibri" w:eastAsia="Calibri" w:hAnsi="Calibri"/>
+                <w:b/>
+                <w:bCs/>
+                <w:color w:val="FFFFFF"/>
+                <w:sz w:val="18"/>
+                <w:szCs w:val="18"/>
+              </w:rPr>
+              <w:t xml:space="preserve">Anexo RCG</w:t>
+            </w:r>
+          </w:p>
+        </w:tc>
+      </w:tr>
+      <w:tr>
+        <w:trPr>
+          <w:cantSplit/>
+        </w:trPr>
+        <w:tc>
+          <w:tcPr>
+            <w:tcW w:type="dxa" w:w="5200"/>
+            <w:tcMar>
+              <w:top w:type="dxa" w:w="60"/>
+              <w:left w:type="dxa" w:w="100"/>
+              <w:bottom w:type="dxa" w:w="60"/>
+              <w:right w:type="dxa" w:w="100"/>
+            </w:tcMar>
+          </w:tcPr>
+          <w:p>
+            <w:pPr>
+              <w:spacing w:after="0"/>
+            </w:pPr>
+            <w:r>
+              <w:rPr>
+                <w:rFonts w:ascii="Calibri" w:cs="Calibri" w:eastAsia="Calibri" w:hAnsi="Calibri"/>
+                <w:sz w:val="18"/>
+                <w:szCs w:val="18"/>
+              </w:rPr>
+              <w:t xml:space="preserve">Persona física mexicana, o extranjera residente temporal o permanente</w:t>
+            </w:r>
+          </w:p>
+        </w:tc>
+        <w:tc>
+          <w:tcPr>
+            <w:tcW w:type="dxa" w:w="4300"/>
+            <w:tcMar>
+              <w:top w:type="dxa" w:w="60"/>
+              <w:left w:type="dxa" w:w="100"/>
+              <w:bottom w:type="dxa" w:w="60"/>
+              <w:right w:type="dxa" w:w="100"/>
+            </w:tcMar>
+          </w:tcPr>
+          <w:p>
+            <w:pPr>
+              <w:spacing w:after="0"/>
+            </w:pPr>
+            <w:r>
+              <w:rPr>
+                <w:rFonts w:ascii="Calibri" w:cs="Calibri" w:eastAsia="Calibri" w:hAnsi="Calibri"/>
+                <w:sz w:val="18"/>
+                <w:szCs w:val="18"/>
+              </w:rPr>
+              <w:t xml:space="preserve">Anexo 3</w:t>
+            </w:r>
+          </w:p>
+        </w:tc>
+      </w:tr>
+      <w:tr>
+        <w:trPr>
+          <w:cantSplit/>
+        </w:trPr>
+        <w:tc>
+          <w:tcPr>
+            <w:tcW w:type="dxa" w:w="5200"/>
+            <w:tcMar>
+              <w:top w:type="dxa" w:w="60"/>
+              <w:left w:type="dxa" w:w="100"/>
+              <w:bottom w:type="dxa" w:w="60"/>
+              <w:right w:type="dxa" w:w="100"/>
+            </w:tcMar>
+          </w:tcPr>
+          <w:p>
+            <w:pPr>
+              <w:spacing w:after="0"/>
+            </w:pPr>
+            <w:r>
+              <w:rPr>
+                <w:rFonts w:ascii="Calibri" w:cs="Calibri" w:eastAsia="Calibri" w:hAnsi="Calibri"/>
+                <w:sz w:val="18"/>
+                <w:szCs w:val="18"/>
+              </w:rPr>
+              <w:t xml:space="preserve">Persona moral mexicana</w:t>
+            </w:r>
+          </w:p>
+        </w:tc>
+        <w:tc>
+          <w:tcPr>
+            <w:tcW w:type="dxa" w:w="4300"/>
+            <w:tcMar>
+              <w:top w:type="dxa" w:w="60"/>
+              <w:left w:type="dxa" w:w="100"/>
+              <w:bottom w:type="dxa" w:w="60"/>
+              <w:right w:type="dxa" w:w="100"/>
+            </w:tcMar>
+          </w:tcPr>
+          <w:p>
+            <w:pPr>
+              <w:spacing w:after="0"/>
+            </w:pPr>
+            <w:r>
+              <w:rPr>
+                <w:rFonts w:ascii="Calibri" w:cs="Calibri" w:eastAsia="Calibri" w:hAnsi="Calibri"/>
+                <w:sz w:val="18"/>
+                <w:szCs w:val="18"/>
+              </w:rPr>
+              <w:t xml:space="preserve">Anexo 4</w:t>
+            </w:r>
+          </w:p>
+        </w:tc>
+      </w:tr>
+      <w:tr>
+        <w:trPr>
+          <w:cantSplit/>
+        </w:trPr>
+        <w:tc>
+          <w:tcPr>
+            <w:tcW w:type="dxa" w:w="5200"/>
+            <w:tcMar>
+              <w:top w:type="dxa" w:w="60"/>
+              <w:left w:type="dxa" w:w="100"/>
+              <w:bottom w:type="dxa" w:w="60"/>
+              <w:right w:type="dxa" w:w="100"/>
+            </w:tcMar>
+          </w:tcPr>
+          <w:p>
+            <w:pPr>
+              <w:spacing w:after="0"/>
+            </w:pPr>
+            <w:r>
+              <w:rPr>
+                <w:rFonts w:ascii="Calibri" w:cs="Calibri" w:eastAsia="Calibri" w:hAnsi="Calibri"/>
+                <w:sz w:val="18"/>
+                <w:szCs w:val="18"/>
+              </w:rPr>
+              <w:t xml:space="preserve">Persona moral mexicana de derecho público</w:t>
+            </w:r>
+          </w:p>
+        </w:tc>
+        <w:tc>
+          <w:tcPr>
+            <w:tcW w:type="dxa" w:w="4300"/>
+            <w:tcMar>
+              <w:top w:type="dxa" w:w="60"/>
+              <w:left w:type="dxa" w:w="100"/>
+              <w:bottom w:type="dxa" w:w="60"/>
+              <w:right w:type="dxa" w:w="100"/>
+            </w:tcMar>
+          </w:tcPr>
+          <w:p>
+            <w:pPr>
+              <w:spacing w:after="0"/>
+            </w:pPr>
+            <w:r>
+              <w:rPr>
+                <w:rFonts w:ascii="Calibri" w:cs="Calibri" w:eastAsia="Calibri" w:hAnsi="Calibri"/>
+                <w:sz w:val="18"/>
+                <w:szCs w:val="18"/>
+              </w:rPr>
+              <w:t xml:space="preserve">Anexos 4 Bis, 7 y 7 Bis (según el caso)</w:t>
+            </w:r>
+          </w:p>
+        </w:tc>
+      </w:tr>
+      <w:tr>
+        <w:trPr>
+          <w:cantSplit/>
+        </w:trPr>
+        <w:tc>
+          <w:tcPr>
+            <w:tcW w:type="dxa" w:w="5200"/>
+            <w:tcMar>
+              <w:top w:type="dxa" w:w="60"/>
+              <w:left w:type="dxa" w:w="100"/>
+              <w:bottom w:type="dxa" w:w="60"/>
+              <w:right w:type="dxa" w:w="100"/>
+            </w:tcMar>
+          </w:tcPr>
+          <w:p>
+            <w:pPr>
+              <w:spacing w:after="0"/>
+            </w:pPr>
+            <w:r>
+              <w:rPr>
+                <w:rFonts w:ascii="Calibri" w:cs="Calibri" w:eastAsia="Calibri" w:hAnsi="Calibri"/>
+                <w:sz w:val="18"/>
+                <w:szCs w:val="18"/>
+              </w:rPr>
+              <w:t xml:space="preserve">Persona física extranjera con condición de visitante u otra distinta</w:t>
+            </w:r>
+          </w:p>
+        </w:tc>
+        <w:tc>
+          <w:tcPr>
+            <w:tcW w:type="dxa" w:w="4300"/>
+            <w:tcMar>
+              <w:top w:type="dxa" w:w="60"/>
+              <w:left w:type="dxa" w:w="100"/>
+              <w:bottom w:type="dxa" w:w="60"/>
+              <w:right w:type="dxa" w:w="100"/>
+            </w:tcMar>
+          </w:tcPr>
+          <w:p>
+            <w:pPr>
+              <w:spacing w:after="0"/>
+            </w:pPr>
+            <w:r>
+              <w:rPr>
+                <w:rFonts w:ascii="Calibri" w:cs="Calibri" w:eastAsia="Calibri" w:hAnsi="Calibri"/>
+                <w:sz w:val="18"/>
+                <w:szCs w:val="18"/>
+              </w:rPr>
+              <w:t xml:space="preserve">Anexo 5</w:t>
+            </w:r>
+          </w:p>
+        </w:tc>
+      </w:tr>
+      <w:tr>
+        <w:trPr>
+          <w:cantSplit/>
+        </w:trPr>
+        <w:tc>
+          <w:tcPr>
+            <w:tcW w:type="dxa" w:w="5200"/>
+            <w:tcMar>
+              <w:top w:type="dxa" w:w="60"/>
+              <w:left w:type="dxa" w:w="100"/>
+              <w:bottom w:type="dxa" w:w="60"/>
+              <w:right w:type="dxa" w:w="100"/>
+            </w:tcMar>
+          </w:tcPr>
+          <w:p>
+            <w:pPr>
+              <w:spacing w:after="0"/>
+            </w:pPr>
+            <w:r>
+              <w:rPr>
+                <w:rFonts w:ascii="Calibri" w:cs="Calibri" w:eastAsia="Calibri" w:hAnsi="Calibri"/>
+                <w:sz w:val="18"/>
+                <w:szCs w:val="18"/>
+              </w:rPr>
+              <w:t xml:space="preserve">Persona moral extranjera</w:t>
+            </w:r>
+          </w:p>
+        </w:tc>
+        <w:tc>
+          <w:tcPr>
+            <w:tcW w:type="dxa" w:w="4300"/>
+            <w:tcMar>
+              <w:top w:type="dxa" w:w="60"/>
+              <w:left w:type="dxa" w:w="100"/>
+              <w:bottom w:type="dxa" w:w="60"/>
+              <w:right w:type="dxa" w:w="100"/>
+            </w:tcMar>
+          </w:tcPr>
+          <w:p>
+            <w:pPr>
+              <w:spacing w:after="0"/>
+            </w:pPr>
+            <w:r>
+              <w:rPr>
+                <w:rFonts w:ascii="Calibri" w:cs="Calibri" w:eastAsia="Calibri" w:hAnsi="Calibri"/>
+                <w:sz w:val="18"/>
+                <w:szCs w:val="18"/>
+              </w:rPr>
+              <w:t xml:space="preserve">Anexo 6</w:t>
+            </w:r>
+          </w:p>
+        </w:tc>
+      </w:tr>
+      <w:tr>
+        <w:trPr>
+          <w:cantSplit/>
+        </w:trPr>
+        <w:tc>
+          <w:tcPr>
+            <w:tcW w:type="dxa" w:w="5200"/>
+            <w:tcMar>
+              <w:top w:type="dxa" w:w="60"/>
+              <w:left w:type="dxa" w:w="100"/>
+              <w:bottom w:type="dxa" w:w="60"/>
+              <w:right w:type="dxa" w:w="100"/>
+            </w:tcMar>
+          </w:tcPr>
+          <w:p>
+            <w:pPr>
+              <w:spacing w:after="0"/>
+            </w:pPr>
+            <w:r>
+              <w:rPr>
+                <w:rFonts w:ascii="Calibri" w:cs="Calibri" w:eastAsia="Calibri" w:hAnsi="Calibri"/>
+                <w:sz w:val="18"/>
+                <w:szCs w:val="18"/>
+              </w:rPr>
+              <w:t xml:space="preserve">Embajada, consulado u organismo internacional</w:t>
+            </w:r>
+          </w:p>
+        </w:tc>
+        <w:tc>
+          <w:tcPr>
+            <w:tcW w:type="dxa" w:w="4300"/>
+            <w:tcMar>
+              <w:top w:type="dxa" w:w="60"/>
+              <w:left w:type="dxa" w:w="100"/>
+              <w:bottom w:type="dxa" w:w="60"/>
+              <w:right w:type="dxa" w:w="100"/>
+            </w:tcMar>
+          </w:tcPr>
+          <w:p>
+            <w:pPr>
+              <w:spacing w:after="0"/>
+            </w:pPr>
+            <w:r>
+              <w:rPr>
+                <w:rFonts w:ascii="Calibri" w:cs="Calibri" w:eastAsia="Calibri" w:hAnsi="Calibri"/>
+                <w:sz w:val="18"/>
+                <w:szCs w:val="18"/>
+              </w:rPr>
+              <w:t xml:space="preserve">Anexo 6 Bis</w:t>
+            </w:r>
+          </w:p>
+        </w:tc>
+      </w:tr>
+      <w:tr>
+        <w:trPr>
+          <w:cantSplit/>
+        </w:trPr>
+        <w:tc>
+          <w:tcPr>
+            <w:tcW w:type="dxa" w:w="5200"/>
+            <w:tcMar>
+              <w:top w:type="dxa" w:w="60"/>
+              <w:left w:type="dxa" w:w="100"/>
+              <w:bottom w:type="dxa" w:w="60"/>
+              <w:right w:type="dxa" w:w="100"/>
+            </w:tcMar>
+          </w:tcPr>
+          <w:p>
+            <w:pPr>
+              <w:spacing w:after="0"/>
+            </w:pPr>
+            <w:r>
+              <w:rPr>
+                <w:rFonts w:ascii="Calibri" w:cs="Calibri" w:eastAsia="Calibri" w:hAnsi="Calibri"/>
+                <w:sz w:val="18"/>
+                <w:szCs w:val="18"/>
+              </w:rPr>
+              <w:t xml:space="preserve">Fideicomiso</w:t>
+            </w:r>
+          </w:p>
+        </w:tc>
+        <w:tc>
+          <w:tcPr>
+            <w:tcW w:type="dxa" w:w="4300"/>
+            <w:tcMar>
+              <w:top w:type="dxa" w:w="60"/>
+              <w:left w:type="dxa" w:w="100"/>
+              <w:bottom w:type="dxa" w:w="60"/>
+              <w:right w:type="dxa" w:w="100"/>
+            </w:tcMar>
+          </w:tcPr>
+          <w:p>
+            <w:pPr>
+              <w:spacing w:after="0"/>
+            </w:pPr>
+            <w:r>
+              <w:rPr>
+                <w:rFonts w:ascii="Calibri" w:cs="Calibri" w:eastAsia="Calibri" w:hAnsi="Calibri"/>
+                <w:sz w:val="18"/>
+                <w:szCs w:val="18"/>
+              </w:rPr>
+              <w:t xml:space="preserve">Anexo 8</w:t>
+            </w:r>
+          </w:p>
+        </w:tc>
+      </w:tr>
+      <w:tr>
+        <w:trPr>
+          <w:cantSplit/>
+        </w:trPr>
+        <w:tc>
+          <w:tcPr>
+            <w:tcW w:type="dxa" w:w="5200"/>
+            <w:tcMar>
+              <w:top w:type="dxa" w:w="60"/>
+              <w:left w:type="dxa" w:w="100"/>
+              <w:bottom w:type="dxa" w:w="60"/>
+              <w:right w:type="dxa" w:w="100"/>
+            </w:tcMar>
+          </w:tcPr>
+          <w:p>
+            <w:pPr>
+              <w:spacing w:after="0"/>
+            </w:pPr>
+            <w:r>
+              <w:rPr>
+                <w:rFonts w:ascii="Calibri" w:cs="Calibri" w:eastAsia="Calibri" w:hAnsi="Calibri"/>
+                <w:sz w:val="18"/>
+                <w:szCs w:val="18"/>
+              </w:rPr>
+              <w:t xml:space="preserve">Otra figura o estructura jurídica sin personalidad propia</w:t>
+            </w:r>
+          </w:p>
+        </w:tc>
+        <w:tc>
+          <w:tcPr>
+            <w:tcW w:type="dxa" w:w="4300"/>
+            <w:tcMar>
+              <w:top w:type="dxa" w:w="60"/>
+              <w:left w:type="dxa" w:w="100"/>
+              <w:bottom w:type="dxa" w:w="60"/>
+              <w:right w:type="dxa" w:w="100"/>
+            </w:tcMar>
+          </w:tcPr>
+          <w:p>
+            <w:pPr>
+              <w:spacing w:after="0"/>
+            </w:pPr>
+            <w:r>
+              <w:rPr>
+                <w:rFonts w:ascii="Calibri" w:cs="Calibri" w:eastAsia="Calibri" w:hAnsi="Calibri"/>
+                <w:sz w:val="18"/>
+                <w:szCs w:val="18"/>
+              </w:rPr>
+              <w:t xml:space="preserve">Criterio del Programa: datos del Anexo 8 aplicables por analogía, instrumento que le da origen e identificación de quienes la administran o controlan</w:t>
+            </w:r>
+          </w:p>
+        </w:tc>
+      </w:tr>
+    </w:tbl>
+    <w:p>
+      <w:pPr>
+        <w:spacing w:after="80"/>
+      </w:pPr>
+    </w:p>
+    <w:p>
+      <w:pPr>
+        <w:pStyle w:val="ListParagraph"/>
+        <w:numPr>
+          <w:ilvl w:val="0"/>
+          <w:numId w:val="1"/>
+        </w:numPr>
+        <w:spacing w:after="40"/>
+      </w:pPr>
+      <w:r>
+        <w:rPr>
+          <w:rFonts w:ascii="Calibri" w:cs="Calibri" w:eastAsia="Calibri" w:hAnsi="Calibri"/>
+          <w:sz w:val="20"/>
+          <w:szCs w:val="20"/>
+        </w:rPr>
+        <w:t xml:space="preserve">Cotejo: las copias se cotejan contra el original o contra copia certificada; en el expediente se asienta la fecha y quién realizó el cotejo. No se acepta la cédula profesional como identificación oficial.</w:t>
+      </w:r>
+    </w:p>
+    <w:p>
+      <w:pPr>
+        <w:pStyle w:val="ListParagraph"/>
+        <w:numPr>
+          <w:ilvl w:val="0"/>
+          <w:numId w:val="1"/>
+        </w:numPr>
+        <w:spacing w:after="40"/>
+      </w:pPr>
+      <w:r>
+        <w:rPr>
+          <w:rFonts w:ascii="Calibri" w:cs="Calibri" w:eastAsia="Calibri" w:hAnsi="Calibri"/>
+          <w:sz w:val="20"/>
+          <w:szCs w:val="20"/>
+        </w:rPr>
+        <w:t xml:space="preserve">Verificación: se verifica la vigencia de la identificación oficial y la congruencia de los datos (CURP, RFC, domicilio, fecha de nacimiento o constitución) con los documentos y con las fuentes oficiales disponibles. Cualquier inconsistencia se aclara antes del acto; si no se aclara, se aplican los criterios de abstención de este Manual.</w:t>
+      </w:r>
+    </w:p>
+    <w:p>
+      <w:pPr>
+        <w:pStyle w:val="ListParagraph"/>
+        <w:numPr>
+          <w:ilvl w:val="0"/>
+          <w:numId w:val="1"/>
+        </w:numPr>
+        <w:spacing w:after="40"/>
+      </w:pPr>
+      <w:r>
+        <w:rPr>
+          <w:rFonts w:ascii="Calibri" w:cs="Calibri" w:eastAsia="Calibri" w:hAnsi="Calibri"/>
+          <w:sz w:val="20"/>
+          <w:szCs w:val="20"/>
+        </w:rPr>
+        <w:t xml:space="preserve">Actualización: al menos una vez al año se verifica que los expedientes de los clientes con Relación de negocios estén completos y actualizados, con comprobante de domicilio no mayor a tres meses cuando el Anexo lo exija (Art. 21). Además, el expediente se actualiza cuando cambie significativamente el Perfil Transaccional (Art. 23 Ter, fr. IV), cuando se reclasifique el Grado de Riesgo y, para clientes de Riesgo alto, en cada reevaluación semestral (criterio del Programa).</w:t>
+      </w:r>
+    </w:p>
+    <w:p>
+      <w:pPr>
+        <w:pStyle w:val="ListParagraph"/>
+        <w:numPr>
+          <w:ilvl w:val="0"/>
+          <w:numId w:val="1"/>
+        </w:numPr>
+        <w:spacing w:after="40"/>
+      </w:pPr>
+      <w:r>
+        <w:rPr>
+          <w:rFonts w:ascii="Calibri" w:cs="Calibri" w:eastAsia="Calibri" w:hAnsi="Calibri"/>
+          <w:sz w:val="20"/>
+          <w:szCs w:val="20"/>
+        </w:rPr>
+        <w:t xml:space="preserve">Actuación por cuenta de otra persona: si hay indicios o hechos de que el cliente actúa por cuenta de un tercero no declarado, se le solicita la información para identificar al Beneficiario Controlador (Art. 22).</w:t>
+      </w:r>
+    </w:p>
+    <w:p>
+      <w:pPr>
+        <w:pStyle w:val="ListParagraph"/>
+        <w:numPr>
+          <w:ilvl w:val="0"/>
+          <w:numId w:val="1"/>
+        </w:numPr>
+        <w:spacing w:after="40"/>
+      </w:pPr>
+      <w:r>
+        <w:rPr>
+          <w:rFonts w:ascii="Calibri" w:cs="Calibri" w:eastAsia="Calibri" w:hAnsi="Calibri"/>
+          <w:sz w:val="20"/>
+          <w:szCs w:val="20"/>
+        </w:rPr>
+        <w:t xml:space="preserve">Formatos y lista de verificación del expediente: Documento D7-COR.</w:t>
       </w:r>
     </w:p>
     <w:p>
@@ -2994,100 +3622,7 @@
           <w:sz w:val="20"/>
           <w:szCs w:val="20"/>
         </w:rPr>
-        <w:t xml:space="preserve">El comportamiento transaccional del cliente se revisa con mayor rigor: cada pago o aportación se compara con su Perfil Transaccional y toda desviación se analiza conforme a los parámetros de alertas de este Manual.</w:t>
-      </w:r>
-    </w:p>
-    <w:p>
-      <w:pPr>
-        <w:shd w:fill="1F3864" w:val="clear"/>
-        <w:spacing w:after="100" w:before="220"/>
-      </w:pPr>
-      <w:r>
-        <w:rPr>
-          <w:rFonts w:ascii="Calibri" w:cs="Calibri" w:eastAsia="Calibri" w:hAnsi="Calibri"/>
-          <w:b/>
-          <w:bCs/>
-          <w:color w:val="FFFFFF"/>
-          <w:sz w:val="22"/>
-          <w:szCs w:val="22"/>
-        </w:rPr>
-        <w:t xml:space="preserve">Capítulo 6: Personas Expuestas Políticamente (PEP's) y Beneficiario Controlador</w:t>
-      </w:r>
-    </w:p>
-    <w:p>
-      <w:pPr>
-        <w:spacing w:after="110"/>
-      </w:pPr>
-      <w:r>
-        <w:rPr>
-          <w:rFonts w:ascii="Calibri" w:cs="Calibri" w:eastAsia="Calibri" w:hAnsi="Calibri"/>
-          <w:sz w:val="20"/>
-          <w:szCs w:val="20"/>
-        </w:rPr>
-        <w:t xml:space="preserve">Se considera PEP a la persona física que desempeña o ha desempeñado funciones públicas prominentes en territorio nacional o en el extranjero, así como a su cónyuge, concubina o concubinario, parientes por consanguinidad o afinidad hasta el segundo grado, y a los socios o asociados con quienes mantenga vínculos patrimoniales (Art. 23 Quáter RCG). La calidad de PEP nacional se conserva durante el año siguiente a aquel en que la persona dejó el cargo. Ver Política de PEP's, Documento D8-COR.</w:t>
-      </w:r>
-    </w:p>
-    <w:p>
-      <w:pPr>
-        <w:spacing w:after="110"/>
-      </w:pPr>
-      <w:r>
-        <w:rPr>
-          <w:rFonts w:ascii="Calibri" w:cs="Calibri" w:eastAsia="Calibri" w:hAnsi="Calibri"/>
-          <w:b/>
-          <w:sz w:val="20"/>
-          <w:szCs w:val="20"/>
-        </w:rPr>
-        <w:t xml:space="preserve">Beneficiario Controlador (Art. 18, fr. III, de la Ley).</w:t>
-      </w:r>
-      <w:r>
-        <w:rPr>
-          <w:rFonts w:ascii="Calibri" w:cs="Calibri" w:eastAsia="Calibri" w:hAnsi="Calibri"/>
-          <w:b w:val="0"/>
-          <w:sz w:val="20"/>
-          <w:szCs w:val="20"/>
-        </w:rPr>
-        <w:t xml:space="preserve"> Cuando el cliente sea persona moral, fideicomiso u otra figura jurídica, el Corredor recaba los documentos que permitan identificar a su Beneficiario Controlador; cuando sea persona física, recaba la declaración acerca de si tiene o no conocimiento de la existencia de un Beneficiario Controlador y, en su caso, la documentación que permita identificarlo — ver Sección E del Documento D7-COR.</w:t>
-      </w:r>
-    </w:p>
-    <w:p>
-      <w:pPr>
-        <w:spacing w:after="110"/>
-      </w:pPr>
-      <w:r>
-        <w:rPr>
-          <w:rFonts w:ascii="Calibri" w:cs="Calibri" w:eastAsia="Calibri" w:hAnsi="Calibri"/>
-          <w:b/>
-          <w:sz w:val="20"/>
-          <w:szCs w:val="20"/>
-        </w:rPr>
-        <w:t xml:space="preserve">Orden de prelación (Art. 23 Quinquies RCG):</w:t>
-      </w:r>
-      <w:r>
-        <w:rPr>
-          <w:rFonts w:ascii="Calibri" w:cs="Calibri" w:eastAsia="Calibri" w:hAnsi="Calibri"/>
-          <w:b w:val="0"/>
-          <w:sz w:val="20"/>
-          <w:szCs w:val="20"/>
-        </w:rPr>
-        <w:t xml:space="preserve"> (i) la persona o personas físicas que tengan el 25% o más del capital social; (ii) si no existe, quien controle a la persona moral por otros medios; (iii) en último término, el funcionario administrativo de mayor grado. En fideicomisos se aplica el Art. 23 Quinquies 1, ascendiendo en la cadena de titularidad hasta la persona física que ejerza el control efectivo. No se exige la identificación del Beneficiario Controlador en los supuestos de exención del Art. 23 Quinquies 2 RCG (entre otros, quienes cotizan en bolsa y las personas morales de los Anexos 4 Bis, 6 Bis, 7-A y 7 Bis-A).</w:t>
-      </w:r>
-    </w:p>
-    <w:p>
-      <w:pPr>
-        <w:keepNext/>
-        <w:spacing w:after="60" w:before="120"/>
-      </w:pPr>
-      <w:r>
-        <w:rPr>
-          <w:rFonts w:ascii="Calibri" w:cs="Calibri" w:eastAsia="Calibri" w:hAnsi="Calibri"/>
-          <w:b/>
-          <w:bCs/>
-          <w:color w:val="0A1628"/>
-          <w:sz w:val="19"/>
-          <w:szCs w:val="19"/>
-        </w:rPr>
-        <w:t xml:space="preserve">6.1 Fuentes, validación de coincidencias y monitoreo de PEP (Art. 37 Bis, fr. IV, RCG)</w:t>
+        <w:t xml:space="preserve">Detección posterior: si la calidad de PEP o el Riesgo alto se identifica después de iniciada la relación, su continuidad requiere la misma aprobación o constancia del Art. 23 Ter 5 —que aplica "previamente o con posterioridad" al acto—. Mientras no se obtenga, no se celebran nuevos actos u operaciones con ese cliente.</w:t>
       </w:r>
     </w:p>
     <w:p>
@@ -3105,7 +3640,24 @@
           <w:sz w:val="20"/>
           <w:szCs w:val="20"/>
         </w:rPr>
-        <w:t xml:space="preserve">La consulta de PEP nacionales se realiza en la aplicación Consulta PEP 2.0 de la UIF, con la e.firma del alta y registro, en cuanto esté habilitada para quienes realizan Actividades Vulnerables (nueve meses después de la entrada en vigor del Acuerdo 115/2026, Transitorio Décimo). Mientras tanto, se recaba la declaración del cliente sobre su calidad de PEP y se consultan fuentes públicas oficiales.</w:t>
+        <w:t xml:space="preserve">El comportamiento transaccional del cliente se revisa con mayor rigor: cada pago o aportación se compara con su Perfil Transaccional y toda desviación se analiza conforme a los parámetros de alertas de este Manual.</w:t>
+      </w:r>
+    </w:p>
+    <w:p>
+      <w:pPr>
+        <w:keepNext/>
+        <w:spacing w:after="60" w:before="120"/>
+      </w:pPr>
+      <w:r>
+        <w:rPr>
+          <w:rFonts w:ascii="Calibri" w:cs="Calibri" w:eastAsia="Calibri" w:hAnsi="Calibri"/>
+          <w:b/>
+          <w:bCs/>
+          <w:color w:val="0A1628"/>
+          <w:sz w:val="19"/>
+          <w:szCs w:val="19"/>
+        </w:rPr>
+        <w:t xml:space="preserve">5.4 Países, territorios y jurisdicciones de alto Riesgo (Arts. 23 Bis 4 y 41, fr. V, RCG)</w:t>
       </w:r>
     </w:p>
     <w:p>
@@ -3123,7 +3675,7 @@
           <w:sz w:val="20"/>
           <w:szCs w:val="20"/>
         </w:rPr>
-        <w:t xml:space="preserve">Las PEP extranjeras se identifican mediante la declaración del cliente y fuentes públicas o listas de organismos internacionales reconocidos; se clasifican siempre como Riesgo alto (Art. 23 Bis 4 RCG).</w:t>
+        <w:t xml:space="preserve">Fuentes: (i) la lista de países y jurisdicciones que la UIF pone a disposición en el Portal en Internet (Art. 23 Bis 4, último párrafo); (ii) los países y territorios que la legislación fiscal mexicana considera de régimen fiscal preferente; y (iii) las jurisdicciones que el GAFI/FATF y el GAFILAT señalan como de alto Riesgo o sujetas a monitoreo intensificado. Las listas se revisan cada vez que se actualizan; el GAFI lo hace tras sus plenarias, normalmente tres veces al año.</w:t>
       </w:r>
     </w:p>
     <w:p>
@@ -3141,7 +3693,7 @@
           <w:sz w:val="20"/>
           <w:szCs w:val="20"/>
         </w:rPr>
-        <w:t xml:space="preserve">Las coincidencias se validan con la fecha de nacimiento, la CURP o el RFC y el cargo, con el mismo tratamiento de falsos positivos del Capítulo 15; el resultado se documenta en el expediente.</w:t>
+        <w:t xml:space="preserve">Detección: se revisan la nacionalidad, la residencia y el domicilio del cliente y de su Beneficiario Controlador, el origen y destino de los recursos, las cuentas de origen y las contrapartes.</w:t>
       </w:r>
     </w:p>
     <w:p>
@@ -3159,146 +3711,7 @@
           <w:sz w:val="20"/>
           <w:szCs w:val="20"/>
         </w:rPr>
-        <w:t xml:space="preserve">Monitoreo: la calidad de PEP se verifica antes de cada acto u operación y en cada reevaluación semestral; la PEP nacional conserva esa calidad durante el año siguiente a aquel en que dejó el cargo (Art. 23 Quáter RCG).</w:t>
-      </w:r>
-    </w:p>
-    <w:p>
-      <w:pPr>
-        <w:shd w:fill="1F3864" w:val="clear"/>
-        <w:spacing w:after="100" w:before="220"/>
-      </w:pPr>
-      <w:r>
-        <w:rPr>
-          <w:rFonts w:ascii="Calibri" w:cs="Calibri" w:eastAsia="Calibri" w:hAnsi="Calibri"/>
-          <w:b/>
-          <w:bCs/>
-          <w:color w:val="FFFFFF"/>
-          <w:sz w:val="22"/>
-          <w:szCs w:val="22"/>
-        </w:rPr>
-        <w:t xml:space="preserve">Capítulo 7: Operaciones Inusuales</w:t>
-      </w:r>
-    </w:p>
-    <w:p>
-      <w:pPr>
-        <w:spacing w:after="110"/>
-      </w:pPr>
-      <w:r>
-        <w:rPr>
-          <w:rFonts w:ascii="Calibri" w:cs="Calibri" w:eastAsia="Calibri" w:hAnsi="Calibri"/>
-          <w:sz w:val="20"/>
-          <w:szCs w:val="20"/>
-        </w:rPr>
-        <w:t xml:space="preserve">El catálogo de señales de alerta específicas por inciso, así como el procedimiento de reporte interno y presentación del Aviso dentro de las 24 horas siguientes a la detección (Art. 18, fr. VI, de la Ley; Arts. 26 Bis y 26 Bis 1 RCG), se encuentra en el Documento D9-COR.</w:t>
-      </w:r>
-    </w:p>
-    <w:p>
-      <w:pPr>
-        <w:shd w:fill="1F3864" w:val="clear"/>
-        <w:spacing w:after="100" w:before="220"/>
-      </w:pPr>
-      <w:r>
-        <w:rPr>
-          <w:rFonts w:ascii="Calibri" w:cs="Calibri" w:eastAsia="Calibri" w:hAnsi="Calibri"/>
-          <w:b/>
-          <w:bCs/>
-          <w:color w:val="FFFFFF"/>
-          <w:sz w:val="22"/>
-          <w:szCs w:val="22"/>
-        </w:rPr>
-        <w:t xml:space="preserve">Capítulo 8: Restricción de Pagos en Efectivo y Forma de Pago</w:t>
-      </w:r>
-    </w:p>
-    <w:p>
-      <w:pPr>
-        <w:spacing w:after="110"/>
-      </w:pPr>
-      <w:r>
-        <w:rPr>
-          <w:rFonts w:ascii="Calibri" w:cs="Calibri" w:eastAsia="Calibri" w:hAnsi="Calibri"/>
-          <w:sz w:val="20"/>
-          <w:szCs w:val="20"/>
-        </w:rPr>
-        <w:t xml:space="preserve">Conforme al artículo 32 LFPIORPI, está PROHIBIDO liquidar o pagar, o aceptar la liquidación o el pago, con monedas y billetes, nacionales o extranjeros, o con metales preciosos — aun cuando el pago se realice en efectivo por conducto de una Entidad Financiera — los actos de sus fracciones. Para la Correduría son relevantes: la fracción VI — transmisión de dominio o constitución de derechos de cualquier naturaleza sobre los títulos representativos de partes sociales o acciones, por un valor igual o superior a 3,210 UMA (~$376,565 MXN 2026); la fracción II — transmisión de propiedad o constitución de derechos reales sobre vehículos aéreos, marítimos o terrestres (por ejemplo, hipotecas sobre buques o aeronaves), por igual umbral; y la fracción VIII — consignación de pago relacionada con esos actos. La fracción I (inmuebles) no es aplicable porque el Corredor no actúa como fedatario en actos sobre inmuebles.</w:t>
-      </w:r>
-    </w:p>
-    <w:p>
-      <w:pPr>
-        <w:spacing w:after="110"/>
-      </w:pPr>
-      <w:r>
-        <w:rPr>
-          <w:rFonts w:ascii="Calibri" w:cs="Calibri" w:eastAsia="Calibri" w:hAnsi="Calibri"/>
-          <w:b w:val="0"/>
-          <w:sz w:val="20"/>
-          <w:szCs w:val="20"/>
-        </w:rPr>
-        <w:t xml:space="preserve">Conforme al artículo 33, en los instrumentos en que haga constar actos del artículo 32, el Corredor identifica la forma en que se pagan las obligaciones cuando la operación tenga un valor igual o superior a 8,025 UMA (~$941,413 MXN); si el valor es inferior y el acto fue pagado total o parcialmente antes de la firma, basta la declaración que bajo protesta de decir verdad hagan las personas Clientes o Usuarias. </w:t>
-      </w:r>
-      <w:r>
-        <w:rPr>
-          <w:rFonts w:ascii="Calibri" w:cs="Calibri" w:eastAsia="Calibri" w:hAnsi="Calibri"/>
-          <w:b/>
-          <w:sz w:val="20"/>
-          <w:szCs w:val="20"/>
-        </w:rPr>
-        <w:t xml:space="preserve">Criterio del Programa:</w:t>
-      </w:r>
-      <w:r>
-        <w:rPr>
-          <w:rFonts w:ascii="Calibri" w:cs="Calibri" w:eastAsia="Calibri" w:hAnsi="Calibri"/>
-          <w:b w:val="0"/>
-          <w:sz w:val="20"/>
-          <w:szCs w:val="20"/>
-        </w:rPr>
-        <w:t xml:space="preserve"> en toda compraventa de acciones o partes sociales de 3,210 UMA o más, la póliza asienta la forma de pago y la manifestación de que no se utilizó efectivo. El incumplimiento del artículo 33 se sanciona con 2,000 a 10,000 UMA (Arts. 53, fr. V, y 54, fr. II).</w:t>
-      </w:r>
-    </w:p>
-    <w:p>
-      <w:pPr>
-        <w:shd w:fill="1F3864" w:val="clear"/>
-        <w:spacing w:after="100" w:before="220"/>
-      </w:pPr>
-      <w:r>
-        <w:rPr>
-          <w:rFonts w:ascii="Calibri" w:cs="Calibri" w:eastAsia="Calibri" w:hAnsi="Calibri"/>
-          <w:b/>
-          <w:bCs/>
-          <w:color w:val="FFFFFF"/>
-          <w:sz w:val="22"/>
-          <w:szCs w:val="22"/>
-        </w:rPr>
-        <w:t xml:space="preserve">Capítulo 9: Presentación de Avisos ante el SAT</w:t>
-      </w:r>
-    </w:p>
-    <w:p>
-      <w:pPr>
-        <w:spacing w:after="110"/>
-      </w:pPr>
-      <w:r>
-        <w:rPr>
-          <w:rFonts w:ascii="Calibri" w:cs="Calibri" w:eastAsia="Calibri" w:hAnsi="Calibri"/>
-          <w:sz w:val="20"/>
-          <w:szCs w:val="20"/>
-        </w:rPr>
-        <w:t xml:space="preserve">Los Avisos se presentan a través del Portal en Internet, con la e.firma del Corredor, a más tardar el día 17 del mes inmediato siguiente a aquel en que se realizó el acto (Art. 23 de la Ley; Art. 24 RCG), uno por cada acto que cumpla la condición de Aviso (Art. 24 Bis 1 RCG). La fecha del acto se determina conforme a los artículos 5 y 24 del Reglamento. El canal fiscal alterno del Art. 24, último párrafo, de la Ley es exclusivo de los notarios y no aplica a la Correduría. Si en el mes no hubo actos objeto de Aviso, se presenta el informe del Art. 25 RCG. El control mensual de actos y Avisos se documenta en el Documento D12-COR; el alta y registro, en el Documento D3-COR.</w:t>
-      </w:r>
-    </w:p>
-    <w:p>
-      <w:pPr>
-        <w:keepNext/>
-        <w:spacing w:after="60" w:before="120"/>
-      </w:pPr>
-      <w:r>
-        <w:rPr>
-          <w:rFonts w:ascii="Calibri" w:cs="Calibri" w:eastAsia="Calibri" w:hAnsi="Calibri"/>
-          <w:b/>
-          <w:bCs/>
-          <w:color w:val="0A1628"/>
-          <w:sz w:val="19"/>
-          <w:szCs w:val="19"/>
-        </w:rPr>
-        <w:t xml:space="preserve">9.1 Envío, control de calidad y acuses (Art. 37 Bis, fr. VI, RCG)</w:t>
+        <w:t xml:space="preserve">Cliente no residente vinculado con esas jurisdicciones: se clasifica siempre como de Riesgo alto y se recaban y asientan las razones por las que celebra el acto u operación en México (Art. 23 Bis 4).</w:t>
       </w:r>
     </w:p>
     <w:p>
@@ -3316,7 +3729,7 @@
           <w:sz w:val="20"/>
           <w:szCs w:val="20"/>
         </w:rPr>
-        <w:t xml:space="preserve">Vehículo: Portal en Internet del SAT, en el formato oficial vigente y con la e.firma del Corredor Público Titular con la que se realizó el alta y registro (Art. 24 RCG).</w:t>
+        <w:t xml:space="preserve">Cliente residente con vínculo con esas jurisdicciones (recursos, cuentas, contrapartes o Beneficiario Controlador): el indicador geográfico de la Metodología EBR se califica en nivel alto y se aplican las medidas reforzadas de este Manual.</w:t>
       </w:r>
     </w:p>
     <w:p>
@@ -3334,7 +3747,100 @@
           <w:sz w:val="20"/>
           <w:szCs w:val="20"/>
         </w:rPr>
-        <w:t xml:space="preserve">Calendario mensual (criterio del Programa): cierre de los actos u operaciones del mes el último día natural; preparación de los Avisos dentro de los primeros diez días; envío a más tardar el día 15, como margen de seguridad frente al límite legal del día 17.</w:t>
+        <w:t xml:space="preserve">El sistema de alertas genera una alerta automática para todo acto u operación vinculado con esas jurisdicciones (Art. 41, fr. V), que se analiza conforme al procedimiento de análisis de alertas de este Manual. Si no puede documentarse una razón económica legítima, se aplican los criterios de abstención y, en su caso, se presenta el Aviso de 24 horas.</w:t>
+      </w:r>
+    </w:p>
+    <w:p>
+      <w:pPr>
+        <w:shd w:fill="1F3864" w:val="clear"/>
+        <w:spacing w:after="100" w:before="220"/>
+      </w:pPr>
+      <w:r>
+        <w:rPr>
+          <w:rFonts w:ascii="Calibri" w:cs="Calibri" w:eastAsia="Calibri" w:hAnsi="Calibri"/>
+          <w:b/>
+          <w:bCs/>
+          <w:color w:val="FFFFFF"/>
+          <w:sz w:val="22"/>
+          <w:szCs w:val="22"/>
+        </w:rPr>
+        <w:t xml:space="preserve">Capítulo 6: Personas Expuestas Políticamente (PEP's) y Beneficiario Controlador</w:t>
+      </w:r>
+    </w:p>
+    <w:p>
+      <w:pPr>
+        <w:spacing w:after="110"/>
+      </w:pPr>
+      <w:r>
+        <w:rPr>
+          <w:rFonts w:ascii="Calibri" w:cs="Calibri" w:eastAsia="Calibri" w:hAnsi="Calibri"/>
+          <w:sz w:val="20"/>
+          <w:szCs w:val="20"/>
+        </w:rPr>
+        <w:t xml:space="preserve">Se considera PEP a la persona física que desempeña o ha desempeñado funciones públicas prominentes en territorio nacional o en el extranjero, así como a su cónyuge, concubina o concubinario, parientes por consanguinidad o afinidad hasta el segundo grado, y a los socios o asociados con quienes mantenga vínculos patrimoniales (Art. 23 Quáter RCG). La calidad de PEP nacional se conserva durante el año siguiente a aquel en que la persona dejó el cargo. Ver Política de PEP's, Documento D8-COR.</w:t>
+      </w:r>
+    </w:p>
+    <w:p>
+      <w:pPr>
+        <w:spacing w:after="110"/>
+      </w:pPr>
+      <w:r>
+        <w:rPr>
+          <w:rFonts w:ascii="Calibri" w:cs="Calibri" w:eastAsia="Calibri" w:hAnsi="Calibri"/>
+          <w:b/>
+          <w:sz w:val="20"/>
+          <w:szCs w:val="20"/>
+        </w:rPr>
+        <w:t xml:space="preserve">Beneficiario Controlador (Art. 18, fr. III, de la Ley).</w:t>
+      </w:r>
+      <w:r>
+        <w:rPr>
+          <w:rFonts w:ascii="Calibri" w:cs="Calibri" w:eastAsia="Calibri" w:hAnsi="Calibri"/>
+          <w:b w:val="0"/>
+          <w:sz w:val="20"/>
+          <w:szCs w:val="20"/>
+        </w:rPr>
+        <w:t xml:space="preserve"> Cuando el cliente sea persona moral, fideicomiso u otra figura jurídica, el Corredor recaba los documentos que permitan identificar a su Beneficiario Controlador; cuando sea persona física, recaba la declaración acerca de si tiene o no conocimiento de la existencia de un Beneficiario Controlador y, en su caso, la documentación que permita identificarlo — ver Sección E del Documento D7-COR.</w:t>
+      </w:r>
+    </w:p>
+    <w:p>
+      <w:pPr>
+        <w:spacing w:after="110"/>
+      </w:pPr>
+      <w:r>
+        <w:rPr>
+          <w:rFonts w:ascii="Calibri" w:cs="Calibri" w:eastAsia="Calibri" w:hAnsi="Calibri"/>
+          <w:b/>
+          <w:sz w:val="20"/>
+          <w:szCs w:val="20"/>
+        </w:rPr>
+        <w:t xml:space="preserve">Orden de prelación (Art. 23 Quinquies RCG):</w:t>
+      </w:r>
+      <w:r>
+        <w:rPr>
+          <w:rFonts w:ascii="Calibri" w:cs="Calibri" w:eastAsia="Calibri" w:hAnsi="Calibri"/>
+          <w:b w:val="0"/>
+          <w:sz w:val="20"/>
+          <w:szCs w:val="20"/>
+        </w:rPr>
+        <w:t xml:space="preserve"> (i) la persona o personas físicas que tengan el 25% o más del capital social; (ii) si no existe, quien controle a la persona moral por otros medios; (iii) en último término, el funcionario administrativo de mayor grado. En fideicomisos se aplica el Art. 23 Quinquies 1, ascendiendo en la cadena de titularidad hasta la persona física que ejerza el control efectivo. No se exige la identificación del Beneficiario Controlador en los supuestos de exención del Art. 23 Quinquies 2 RCG (entre otros, quienes cotizan en bolsa y las personas morales de los Anexos 4 Bis, 6 Bis, 7-A y 7 Bis-A).</w:t>
+      </w:r>
+    </w:p>
+    <w:p>
+      <w:pPr>
+        <w:keepNext/>
+        <w:spacing w:after="60" w:before="120"/>
+      </w:pPr>
+      <w:r>
+        <w:rPr>
+          <w:rFonts w:ascii="Calibri" w:cs="Calibri" w:eastAsia="Calibri" w:hAnsi="Calibri"/>
+          <w:b/>
+          <w:bCs/>
+          <w:color w:val="0A1628"/>
+          <w:sz w:val="19"/>
+          <w:szCs w:val="19"/>
+        </w:rPr>
+        <w:t xml:space="preserve">6.1 Fuentes, validación de coincidencias y monitoreo de PEP (Art. 37 Bis, fr. IV, RCG)</w:t>
       </w:r>
     </w:p>
     <w:p>
@@ -3352,7 +3858,7 @@
           <w:sz w:val="20"/>
           <w:szCs w:val="20"/>
         </w:rPr>
-        <w:t xml:space="preserve">Control de calidad previo al envío: se verifican contra el expediente los datos del Cliente o Usuaria y del Beneficiario Controlador (nombre, RFC, CURP), la fecha del acto u operación (Arts. 5 y 24 del Reglamento y 24 Bis RCG), el monto, la forma de pago y la descripción del acto. Siempre que sea posible, la verificación la realiza una persona distinta de quien capturó el Aviso.</w:t>
+        <w:t xml:space="preserve">La consulta de PEP nacionales se realiza en la aplicación Consulta PEP 2.0 de la UIF, con la e.firma del alta y registro, en cuanto esté habilitada para quienes realizan Actividades Vulnerables (nueve meses después de la entrada en vigor del Acuerdo 115/2026, Transitorio Décimo). Mientras tanto, se recaba la declaración del cliente sobre su calidad de PEP y se consultan fuentes públicas oficiales.</w:t>
       </w:r>
     </w:p>
     <w:p>
@@ -3370,7 +3876,7 @@
           <w:sz w:val="20"/>
           <w:szCs w:val="20"/>
         </w:rPr>
-        <w:t xml:space="preserve">Acuses: el acuse con sello digital se descarga y conserva en el expediente del cliente y en el control mensual (Documento D12-COR) durante diez años; cada mes se concilian los actos u operaciones realizados, los Avisos o el informe en ceros presentados y sus acuses.</w:t>
+        <w:t xml:space="preserve">Las PEP extranjeras se identifican mediante la declaración del cliente y fuentes públicas o listas de organismos internacionales reconocidos; se clasifican siempre como Riesgo alto (Art. 23 Bis 4 RCG).</w:t>
       </w:r>
     </w:p>
     <w:p>
@@ -3388,7 +3894,7 @@
           <w:sz w:val="20"/>
           <w:szCs w:val="20"/>
         </w:rPr>
-        <w:t xml:space="preserve">Correcciones: si se detecta un error en un Aviso presentado, se presenta el Aviso modificatorio disponible en el Portal y se documentan la causa y la fecha de corrección.</w:t>
+        <w:t xml:space="preserve">Las coincidencias se validan con la fecha de nacimiento, la CURP o el RFC y el cargo, con el mismo tratamiento de falsos positivos del Capítulo 15; el resultado se documenta en el expediente.</w:t>
       </w:r>
     </w:p>
     <w:p>
@@ -3406,7 +3912,7 @@
           <w:sz w:val="20"/>
           <w:szCs w:val="20"/>
         </w:rPr>
-        <w:t xml:space="preserve">Avisos de 24 horas: el análisis que lleva a presentar —o a no presentar— un Aviso por sospecha o por hechos o indicios se documenta por escrito, y su contenido se mantiene en estricta confidencialidad.</w:t>
+        <w:t xml:space="preserve">Monitoreo: la calidad de PEP se verifica antes de cada acto u operación y en cada reevaluación semestral; la PEP nacional conserva esa calidad durante el año siguiente a aquel en que dejó el cargo (Art. 23 Quáter RCG).</w:t>
       </w:r>
     </w:p>
     <w:p>
@@ -3423,7 +3929,7 @@
           <w:sz w:val="22"/>
           <w:szCs w:val="22"/>
         </w:rPr>
-        <w:t xml:space="preserve">Capítulo 10: Resguardo Documental</w:t>
+        <w:t xml:space="preserve">Capítulo 7: Operaciones Inusuales</w:t>
       </w:r>
     </w:p>
     <w:p>
@@ -3436,7 +3942,99 @@
           <w:sz w:val="20"/>
           <w:szCs w:val="20"/>
         </w:rPr>
-        <w:t xml:space="preserve">Aplica la Política de Resguardo Documental, Documento D10-COR — plazo de conservación de al menos 10 años conforme al artículo 18, fracción IV, sin perjuicio de las obligaciones de conservación del archivo y del libro de registro que impone la Ley Federal de Correduría Pública.</w:t>
+        <w:t xml:space="preserve">El catálogo de señales de alerta específicas por inciso, así como el procedimiento de reporte interno y presentación del Aviso dentro de las 24 horas siguientes a la detección (Art. 18, fr. VI, de la Ley; Arts. 26 Bis y 26 Bis 1 RCG), se encuentra en el Documento D9-COR.</w:t>
+      </w:r>
+    </w:p>
+    <w:p>
+      <w:pPr>
+        <w:shd w:fill="1F3864" w:val="clear"/>
+        <w:spacing w:after="100" w:before="220"/>
+      </w:pPr>
+      <w:r>
+        <w:rPr>
+          <w:rFonts w:ascii="Calibri" w:cs="Calibri" w:eastAsia="Calibri" w:hAnsi="Calibri"/>
+          <w:b/>
+          <w:bCs/>
+          <w:color w:val="FFFFFF"/>
+          <w:sz w:val="22"/>
+          <w:szCs w:val="22"/>
+        </w:rPr>
+        <w:t xml:space="preserve">Capítulo 8: Restricción de Pagos en Efectivo y Forma de Pago</w:t>
+      </w:r>
+    </w:p>
+    <w:p>
+      <w:pPr>
+        <w:spacing w:after="110"/>
+      </w:pPr>
+      <w:r>
+        <w:rPr>
+          <w:rFonts w:ascii="Calibri" w:cs="Calibri" w:eastAsia="Calibri" w:hAnsi="Calibri"/>
+          <w:sz w:val="20"/>
+          <w:szCs w:val="20"/>
+        </w:rPr>
+        <w:t xml:space="preserve">Conforme al artículo 32 LFPIORPI, está PROHIBIDO liquidar o pagar, o aceptar la liquidación o el pago, con monedas y billetes, nacionales o extranjeros, o con metales preciosos — aun cuando el pago se realice en efectivo por conducto de una Entidad Financiera — los actos de sus fracciones. Para la Correduría son relevantes: la fracción VI — transmisión de dominio o constitución de derechos de cualquier naturaleza sobre los títulos representativos de partes sociales o acciones, por un valor igual o superior a 3,210 UMA (~$376,565 MXN 2026); la fracción II — transmisión de propiedad o constitución de derechos reales sobre vehículos aéreos, marítimos o terrestres (por ejemplo, hipotecas sobre buques o aeronaves), por igual umbral; y la fracción VIII — consignación de pago relacionada con esos actos. La fracción I (inmuebles) no es aplicable porque el Corredor no actúa como fedatario en actos sobre inmuebles.</w:t>
+      </w:r>
+    </w:p>
+    <w:p>
+      <w:pPr>
+        <w:spacing w:after="110"/>
+      </w:pPr>
+      <w:r>
+        <w:rPr>
+          <w:rFonts w:ascii="Calibri" w:cs="Calibri" w:eastAsia="Calibri" w:hAnsi="Calibri"/>
+          <w:b w:val="0"/>
+          <w:sz w:val="20"/>
+          <w:szCs w:val="20"/>
+        </w:rPr>
+        <w:t xml:space="preserve">Conforme al artículo 33, en los instrumentos en que haga constar actos del artículo 32, el Corredor identifica la forma en que se pagan las obligaciones cuando la operación tenga un valor igual o superior a 8,025 UMA (~$941,413 MXN); si el valor es inferior y el acto fue pagado total o parcialmente antes de la firma, basta la declaración que bajo protesta de decir verdad hagan las personas Clientes o Usuarias. </w:t>
+      </w:r>
+      <w:r>
+        <w:rPr>
+          <w:rFonts w:ascii="Calibri" w:cs="Calibri" w:eastAsia="Calibri" w:hAnsi="Calibri"/>
+          <w:b/>
+          <w:sz w:val="20"/>
+          <w:szCs w:val="20"/>
+        </w:rPr>
+        <w:t xml:space="preserve">Criterio del Programa:</w:t>
+      </w:r>
+      <w:r>
+        <w:rPr>
+          <w:rFonts w:ascii="Calibri" w:cs="Calibri" w:eastAsia="Calibri" w:hAnsi="Calibri"/>
+          <w:b w:val="0"/>
+          <w:sz w:val="20"/>
+          <w:szCs w:val="20"/>
+        </w:rPr>
+        <w:t xml:space="preserve"> en toda compraventa de acciones o partes sociales de 3,210 UMA o más, la póliza asienta la forma de pago y la manifestación de que no se utilizó efectivo. El incumplimiento del artículo 33 se sanciona con 2,000 a 10,000 UMA (Arts. 53, fr. V, y 54, fr. II).</w:t>
+      </w:r>
+    </w:p>
+    <w:p>
+      <w:pPr>
+        <w:shd w:fill="1F3864" w:val="clear"/>
+        <w:spacing w:after="100" w:before="220"/>
+      </w:pPr>
+      <w:r>
+        <w:rPr>
+          <w:rFonts w:ascii="Calibri" w:cs="Calibri" w:eastAsia="Calibri" w:hAnsi="Calibri"/>
+          <w:b/>
+          <w:bCs/>
+          <w:color w:val="FFFFFF"/>
+          <w:sz w:val="22"/>
+          <w:szCs w:val="22"/>
+        </w:rPr>
+        <w:t xml:space="preserve">Capítulo 9: Presentación de Avisos ante el SAT</w:t>
+      </w:r>
+    </w:p>
+    <w:p>
+      <w:pPr>
+        <w:spacing w:after="110"/>
+      </w:pPr>
+      <w:r>
+        <w:rPr>
+          <w:rFonts w:ascii="Calibri" w:cs="Calibri" w:eastAsia="Calibri" w:hAnsi="Calibri"/>
+          <w:sz w:val="20"/>
+          <w:szCs w:val="20"/>
+        </w:rPr>
+        <w:t xml:space="preserve">Los Avisos se presentan a través del Portal en Internet, con la e.firma del Corredor, a más tardar el día 17 del mes inmediato siguiente a aquel en que se realizó el acto (Art. 23 de la Ley; Art. 24 RCG), uno por cada acto que cumpla la condición de Aviso (Art. 24 Bis 1 RCG). La fecha del acto se determina conforme a los artículos 5 y 24 del Reglamento. El canal fiscal alterno del Art. 24, último párrafo, de la Ley es exclusivo de los notarios y no aplica a la Correduría. Si en el mes no hubo actos objeto de Aviso, se presenta el informe del Art. 25 RCG. El control mensual de actos y Avisos se documenta en el Documento D12-COR; el alta y registro, en el Documento D3-COR.</w:t>
       </w:r>
     </w:p>
     <w:p>
@@ -3453,7 +4051,7 @@
           <w:sz w:val="19"/>
           <w:szCs w:val="19"/>
         </w:rPr>
-        <w:t xml:space="preserve">10.1 Integridad, acceso, respaldo y recuperación (Art. 37 Bis, fr. VII, RCG)</w:t>
+        <w:t xml:space="preserve">9.1 Envío, control de calidad y acuses (Art. 37 Bis, fr. VI, RCG)</w:t>
       </w:r>
     </w:p>
     <w:p>
@@ -3471,7 +4069,7 @@
           <w:sz w:val="20"/>
           <w:szCs w:val="20"/>
         </w:rPr>
-        <w:t xml:space="preserve">Cada Cliente o Usuaria tiene un expediente único (físico, digital o mixto) con un índice de su contenido; los documentos digitalizados conservan su legibilidad y, cuando proceda, se resguarda el original.</w:t>
+        <w:t xml:space="preserve">Vehículo: Portal en Internet del SAT, en el formato oficial vigente y con la e.firma del Corredor Público Titular con la que se realizó el alta y registro (Art. 24 RCG).</w:t>
       </w:r>
     </w:p>
     <w:p>
@@ -3489,7 +4087,7 @@
           <w:sz w:val="20"/>
           <w:szCs w:val="20"/>
         </w:rPr>
-        <w:t xml:space="preserve">Integridad: los registros no se alteran; las correcciones se hacen mediante una nueva versión fechada que conserva la anterior.</w:t>
+        <w:t xml:space="preserve">Calendario mensual (criterio del Programa): cierre de los actos u operaciones del mes el último día natural; preparación de los Avisos dentro de los primeros diez días; envío a más tardar el día 15, como margen de seguridad frente al límite legal del día 17.</w:t>
       </w:r>
     </w:p>
     <w:p>
@@ -3507,7 +4105,7 @@
           <w:sz w:val="20"/>
           <w:szCs w:val="20"/>
         </w:rPr>
-        <w:t xml:space="preserve">Acceso: restringido a las personas autorizadas en la sección de protección de datos de este Manual y al auditor.</w:t>
+        <w:t xml:space="preserve">Control de calidad previo al envío: se verifican contra el expediente los datos del Cliente o Usuaria y del Beneficiario Controlador (nombre, RFC, CURP), la fecha del acto u operación (Arts. 5 y 24 del Reglamento y 24 Bis RCG), el monto, la forma de pago y la descripción del acto. Siempre que sea posible, la verificación la realiza una persona distinta de quien capturó el Aviso.</w:t>
       </w:r>
     </w:p>
     <w:p>
@@ -3525,7 +4123,7 @@
           <w:sz w:val="20"/>
           <w:szCs w:val="20"/>
         </w:rPr>
-        <w:t xml:space="preserve">Respaldo y recuperación: respaldo de la información digital al menos una vez por semana en una ubicación distinta de la principal y prueba anual de recuperación, documentada (criterio del Programa).</w:t>
+        <w:t xml:space="preserve">Acuses: el acuse con sello digital se descarga y conserva en el expediente del cliente y en el control mensual (Documento D12-COR) durante diez años; cada mes se concilian los actos u operaciones realizados, los Avisos o el informe en ceros presentados y sus acuses.</w:t>
       </w:r>
     </w:p>
     <w:p>
@@ -3543,54 +4141,7 @@
           <w:sz w:val="20"/>
           <w:szCs w:val="20"/>
         </w:rPr>
-        <w:t xml:space="preserve">Plazos y lugar de conservación: conforme al Documento D10-COR.</w:t>
-      </w:r>
-    </w:p>
-    <w:p>
-      <w:pPr>
-        <w:shd w:fill="1F3864" w:val="clear"/>
-        <w:spacing w:after="100" w:before="220"/>
-      </w:pPr>
-      <w:r>
-        <w:rPr>
-          <w:rFonts w:ascii="Calibri" w:cs="Calibri" w:eastAsia="Calibri" w:hAnsi="Calibri"/>
-          <w:b/>
-          <w:bCs/>
-          <w:color w:val="FFFFFF"/>
-          <w:sz w:val="22"/>
-          <w:szCs w:val="22"/>
-        </w:rPr>
-        <w:t xml:space="preserve">Capítulo 11: Capacitación</w:t>
-      </w:r>
-    </w:p>
-    <w:p>
-      <w:pPr>
-        <w:spacing w:after="110"/>
-      </w:pPr>
-      <w:r>
-        <w:rPr>
-          <w:rFonts w:ascii="Calibri" w:cs="Calibri" w:eastAsia="Calibri" w:hAnsi="Calibri"/>
-          <w:sz w:val="20"/>
-          <w:szCs w:val="20"/>
-        </w:rPr>
-        <w:t xml:space="preserve">Aplica el Programa Anual de Capacitación, Documento D11-COR, con los casos prácticos (D11B-COR) y la evaluación de comprensión (D11C-COR) adaptados a la correduría pública. Los cursos se imparten al menos una vez al año, por instructores con experiencia acreditable de al menos cinco años en la materia (Art. 39 Bis RCG), y su evidencia se conserva por diez años (Art. 39 Bis 1 RCG).</w:t>
-      </w:r>
-    </w:p>
-    <w:p>
-      <w:pPr>
-        <w:keepNext/>
-        <w:spacing w:after="60" w:before="120"/>
-      </w:pPr>
-      <w:r>
-        <w:rPr>
-          <w:rFonts w:ascii="Calibri" w:cs="Calibri" w:eastAsia="Calibri" w:hAnsi="Calibri"/>
-          <w:b/>
-          <w:bCs/>
-          <w:color w:val="0A1628"/>
-          <w:sz w:val="19"/>
-          <w:szCs w:val="19"/>
-        </w:rPr>
-        <w:t xml:space="preserve">11.1 Evaluación y medidas ante resultados no satisfactorios (Art. 39 Bis 1 RCG)</w:t>
+        <w:t xml:space="preserve">Correcciones: si se detecta un error en un Aviso presentado, se presenta el Aviso modificatorio disponible en el Portal y se documentan la causa y la fecha de corrección.</w:t>
       </w:r>
     </w:p>
     <w:p>
@@ -3608,7 +4159,54 @@
           <w:sz w:val="20"/>
           <w:szCs w:val="20"/>
         </w:rPr>
-        <w:t xml:space="preserve">Al concluir cada curso, los participantes presentan la evaluación de conocimientos del Documento D11C-COR; la calificación mínima aprobatoria es la que fija ese documento (aproximadamente 70 %). La constancia de participación solo se expide a quien aprueba.</w:t>
+        <w:t xml:space="preserve">Avisos de 24 horas: el análisis que lleva a presentar —o a no presentar— un Aviso por sospecha o por hechos o indicios se documenta por escrito, y su contenido se mantiene en estricta confidencialidad.</w:t>
+      </w:r>
+    </w:p>
+    <w:p>
+      <w:pPr>
+        <w:shd w:fill="1F3864" w:val="clear"/>
+        <w:spacing w:after="100" w:before="220"/>
+      </w:pPr>
+      <w:r>
+        <w:rPr>
+          <w:rFonts w:ascii="Calibri" w:cs="Calibri" w:eastAsia="Calibri" w:hAnsi="Calibri"/>
+          <w:b/>
+          <w:bCs/>
+          <w:color w:val="FFFFFF"/>
+          <w:sz w:val="22"/>
+          <w:szCs w:val="22"/>
+        </w:rPr>
+        <w:t xml:space="preserve">Capítulo 10: Resguardo Documental</w:t>
+      </w:r>
+    </w:p>
+    <w:p>
+      <w:pPr>
+        <w:spacing w:after="110"/>
+      </w:pPr>
+      <w:r>
+        <w:rPr>
+          <w:rFonts w:ascii="Calibri" w:cs="Calibri" w:eastAsia="Calibri" w:hAnsi="Calibri"/>
+          <w:sz w:val="20"/>
+          <w:szCs w:val="20"/>
+        </w:rPr>
+        <w:t xml:space="preserve">Aplica la Política de Resguardo Documental, Documento D10-COR — plazo de conservación de al menos 10 años conforme al artículo 18, fracción IV, sin perjuicio de las obligaciones de conservación del archivo y del libro de registro que impone la Ley Federal de Correduría Pública.</w:t>
+      </w:r>
+    </w:p>
+    <w:p>
+      <w:pPr>
+        <w:keepNext/>
+        <w:spacing w:after="60" w:before="120"/>
+      </w:pPr>
+      <w:r>
+        <w:rPr>
+          <w:rFonts w:ascii="Calibri" w:cs="Calibri" w:eastAsia="Calibri" w:hAnsi="Calibri"/>
+          <w:b/>
+          <w:bCs/>
+          <w:color w:val="0A1628"/>
+          <w:sz w:val="19"/>
+          <w:szCs w:val="19"/>
+        </w:rPr>
+        <w:t xml:space="preserve">10.1 Integridad, acceso, respaldo y recuperación (Art. 37 Bis, fr. VII, RCG)</w:t>
       </w:r>
     </w:p>
     <w:p>
@@ -3626,7 +4224,7 @@
           <w:sz w:val="20"/>
           <w:szCs w:val="20"/>
         </w:rPr>
-        <w:t xml:space="preserve">Primera reprobación: capacitación remedial dentro de los quince días hábiles siguientes y nueva evaluación.</w:t>
+        <w:t xml:space="preserve">Cada Cliente o Usuaria tiene un expediente único (físico, digital o mixto) con un índice de su contenido; los documentos digitalizados conservan su legibilidad y, cuando proceda, se resguarda el original.</w:t>
       </w:r>
     </w:p>
     <w:p>
@@ -3644,7 +4242,7 @@
           <w:sz w:val="20"/>
           <w:szCs w:val="20"/>
         </w:rPr>
-        <w:t xml:space="preserve">Segunda reprobación: la persona se retira temporalmente de las funciones de atención al público, identificación de clientes, envío de Avisos o administración de recursos hasta que acredite la evaluación; mientras tanto, actúa bajo supervisión directa.</w:t>
+        <w:t xml:space="preserve">Integridad: los registros no se alteran; las correcciones se hacen mediante una nueva versión fechada que conserva la anterior.</w:t>
       </w:r>
     </w:p>
     <w:p>
@@ -3662,7 +4260,7 @@
           <w:sz w:val="20"/>
           <w:szCs w:val="20"/>
         </w:rPr>
-        <w:t xml:space="preserve">Reincidencia o negativa injustificada a capacitarse: se aplican las medidas disciplinarias previstas en el reglamento interior de trabajo o en el contrato respectivo, conforme a la legislación laboral.</w:t>
+        <w:t xml:space="preserve">Acceso: restringido a las personas autorizadas en la sección de protección de datos de este Manual y al auditor.</w:t>
       </w:r>
     </w:p>
     <w:p>
@@ -3680,67 +4278,7 @@
           <w:sz w:val="20"/>
           <w:szCs w:val="20"/>
         </w:rPr>
-        <w:t xml:space="preserve">El personal que ingrese a áreas de atención al público o de administración de recursos se capacita antes de iniciar funciones o al mismo tiempo (Art. 39 Bis 1, tercer párrafo). Las evaluaciones, constancias, listas de asistencia y medidas aplicadas se conservan por diez años (Documento D11-COR).</w:t>
-      </w:r>
-    </w:p>
-    <w:p>
-      <w:pPr>
-        <w:shd w:fill="1F3864" w:val="clear"/>
-        <w:spacing w:after="100" w:before="220"/>
-      </w:pPr>
-      <w:r>
-        <w:rPr>
-          <w:rFonts w:ascii="Calibri" w:cs="Calibri" w:eastAsia="Calibri" w:hAnsi="Calibri"/>
-          <w:b/>
-          <w:bCs/>
-          <w:color w:val="FFFFFF"/>
-          <w:sz w:val="22"/>
-          <w:szCs w:val="22"/>
-        </w:rPr>
-        <w:t xml:space="preserve">Capítulo 12: Auditoría</w:t>
-      </w:r>
-    </w:p>
-    <w:p>
-      <w:pPr>
-        <w:spacing w:after="110"/>
-      </w:pPr>
-      <w:r>
-        <w:rPr>
-          <w:rFonts w:ascii="Calibri" w:cs="Calibri" w:eastAsia="Calibri" w:hAnsi="Calibri"/>
-          <w:sz w:val="20"/>
-          <w:szCs w:val="20"/>
-        </w:rPr>
-        <w:t xml:space="preserve">La auditoría es anual, por año calendario (Art. 18, fr. XI, de la Ley; Arts. 42 a 51 RCG), y evalúa y dictamina la efectividad del cumplimiento de la Ley, su Reglamento y las RCG; el primer periodo es el año 2028. Cuando el Riesgo de la Correduría, determinado conforme a la sección 5.1, sea bajo o medio, puede realizarla un área de auditoría interna independiente o una persona auditora externa independiente; cuando sea alto, una persona auditora externa independiente con título y cédula en derecho, contaduría, finanzas, administración o informática, al menos tres años de experiencia en la materia y certificación vigente de la UIF. Si la Correduría no cuenta con un área de auditoría interna independiente del Corredor Público Titular, la revisión se encomienda a una persona auditora externa. El dictamen se presenta directamente al Corredor (Art. 42 RCG), se estructura en siete secciones y califica cada obligación como Cumple, Cumple mayoritariamente, Cumple parcialmente, No cumple o No aplica (Arts. 47 y 48 RCG). Formato: Documento D13-COR.</w:t>
-      </w:r>
-    </w:p>
-    <w:p>
-      <w:pPr>
-        <w:keepNext/>
-        <w:spacing w:after="60" w:before="120"/>
-      </w:pPr>
-      <w:r>
-        <w:rPr>
-          <w:rFonts w:ascii="Calibri" w:cs="Calibri" w:eastAsia="Calibri" w:hAnsi="Calibri"/>
-          <w:b/>
-          <w:bCs/>
-          <w:color w:val="0A1628"/>
-          <w:sz w:val="19"/>
-          <w:szCs w:val="19"/>
-        </w:rPr>
-        <w:t xml:space="preserve">12.1 Control interno y supervisión continua (Art. 37 Bis, fr. XII, RCG)</w:t>
-      </w:r>
-    </w:p>
-    <w:p>
-      <w:pPr>
-        <w:spacing w:after="110"/>
-      </w:pPr>
-      <w:r>
-        <w:rPr>
-          <w:rFonts w:ascii="Calibri" w:cs="Calibri" w:eastAsia="Calibri" w:hAnsi="Calibri"/>
-          <w:sz w:val="20"/>
-          <w:szCs w:val="20"/>
-        </w:rPr>
-        <w:t xml:space="preserve">Además de la auditoría anual, se aplican los siguientes controles:</w:t>
+        <w:t xml:space="preserve">Respaldo y recuperación: respaldo de la información digital al menos una vez por semana en una ubicación distinta de la principal y prueba anual de recuperación, documentada (criterio del Programa).</w:t>
       </w:r>
     </w:p>
     <w:p>
@@ -3758,7 +4296,54 @@
           <w:sz w:val="20"/>
           <w:szCs w:val="20"/>
         </w:rPr>
-        <w:t xml:space="preserve">Control preventivo: antes de formalizar cada acto u operación, el Corredor Público Titular — o la persona que designe — verifica con una lista de control que el expediente esté completo, el Grado de Riesgo asignado, las listas y la calidad de PEP consultadas, la forma de pago documentada y, en su caso, la aprobación o constancia de PEP de Riesgo alto.</w:t>
+        <w:t xml:space="preserve">Plazos y lugar de conservación: conforme al Documento D10-COR.</w:t>
+      </w:r>
+    </w:p>
+    <w:p>
+      <w:pPr>
+        <w:shd w:fill="1F3864" w:val="clear"/>
+        <w:spacing w:after="100" w:before="220"/>
+      </w:pPr>
+      <w:r>
+        <w:rPr>
+          <w:rFonts w:ascii="Calibri" w:cs="Calibri" w:eastAsia="Calibri" w:hAnsi="Calibri"/>
+          <w:b/>
+          <w:bCs/>
+          <w:color w:val="FFFFFF"/>
+          <w:sz w:val="22"/>
+          <w:szCs w:val="22"/>
+        </w:rPr>
+        <w:t xml:space="preserve">Capítulo 11: Capacitación</w:t>
+      </w:r>
+    </w:p>
+    <w:p>
+      <w:pPr>
+        <w:spacing w:after="110"/>
+      </w:pPr>
+      <w:r>
+        <w:rPr>
+          <w:rFonts w:ascii="Calibri" w:cs="Calibri" w:eastAsia="Calibri" w:hAnsi="Calibri"/>
+          <w:sz w:val="20"/>
+          <w:szCs w:val="20"/>
+        </w:rPr>
+        <w:t xml:space="preserve">Aplica el Programa Anual de Capacitación, Documento D11-COR, con los casos prácticos (D11B-COR) y la evaluación de comprensión (D11C-COR) adaptados a la correduría pública. Los cursos se imparten al menos una vez al año, por instructores con experiencia acreditable de al menos cinco años en la materia (Art. 39 Bis RCG), y su evidencia se conserva por diez años (Art. 39 Bis 1 RCG).</w:t>
+      </w:r>
+    </w:p>
+    <w:p>
+      <w:pPr>
+        <w:keepNext/>
+        <w:spacing w:after="60" w:before="120"/>
+      </w:pPr>
+      <w:r>
+        <w:rPr>
+          <w:rFonts w:ascii="Calibri" w:cs="Calibri" w:eastAsia="Calibri" w:hAnsi="Calibri"/>
+          <w:b/>
+          <w:bCs/>
+          <w:color w:val="0A1628"/>
+          <w:sz w:val="19"/>
+          <w:szCs w:val="19"/>
+        </w:rPr>
+        <w:t xml:space="preserve">11.1 Evaluación y medidas ante resultados no satisfactorios (Art. 39 Bis 1 RCG)</w:t>
       </w:r>
     </w:p>
     <w:p>
@@ -3776,7 +4361,7 @@
           <w:sz w:val="20"/>
           <w:szCs w:val="20"/>
         </w:rPr>
-        <w:t xml:space="preserve">Control de detección mensual: conciliación de actos u operaciones, Avisos e informes y acuses (Documento D12-COR); revisión de las alertas abiertas y de los Grados de Riesgo con reevaluación vencida.</w:t>
+        <w:t xml:space="preserve">Al concluir cada curso, los participantes presentan la evaluación de conocimientos del Documento D11C-COR; la calificación mínima aprobatoria es la que fija ese documento (aproximadamente 70 %). La constancia de participación solo se expide a quien aprueba.</w:t>
       </w:r>
     </w:p>
     <w:p>
@@ -3794,7 +4379,7 @@
           <w:sz w:val="20"/>
           <w:szCs w:val="20"/>
         </w:rPr>
-        <w:t xml:space="preserve">Revisión trimestral: muestra de al menos el 10 % de los expedientes del trimestre (mínimo cinco), revisada por el Corredor Público Titular, sobre expedientes integrados por el personal, o un tercero independiente cuando el propio Corredor los haya integrado, con hallazgos y acciones correctivas (criterio del Programa).</w:t>
+        <w:t xml:space="preserve">Primera reprobación: capacitación remedial dentro de los quince días hábiles siguientes y nueva evaluación.</w:t>
       </w:r>
     </w:p>
     <w:p>
@@ -3812,7 +4397,7 @@
           <w:sz w:val="20"/>
           <w:szCs w:val="20"/>
         </w:rPr>
-        <w:t xml:space="preserve">Indicadores: porcentaje de expedientes completos, Avisos presentados en plazo, alertas atendidas en plazo y personal capacitado y acreditado.</w:t>
+        <w:t xml:space="preserve">Segunda reprobación: la persona se retira temporalmente de las funciones de atención al público, identificación de clientes, envío de Avisos o administración de recursos hasta que acredite la evaluación; mientras tanto, actúa bajo supervisión directa.</w:t>
       </w:r>
     </w:p>
     <w:p>
@@ -3830,7 +4415,193 @@
           <w:sz w:val="20"/>
           <w:szCs w:val="20"/>
         </w:rPr>
+        <w:t xml:space="preserve">Reincidencia o negativa injustificada a capacitarse: se aplican las medidas disciplinarias previstas en el reglamento interior de trabajo o en el contrato respectivo, conforme a la legislación laboral.</w:t>
+      </w:r>
+    </w:p>
+    <w:p>
+      <w:pPr>
+        <w:pStyle w:val="ListParagraph"/>
+        <w:numPr>
+          <w:ilvl w:val="0"/>
+          <w:numId w:val="1"/>
+        </w:numPr>
+        <w:spacing w:after="40"/>
+      </w:pPr>
+      <w:r>
+        <w:rPr>
+          <w:rFonts w:ascii="Calibri" w:cs="Calibri" w:eastAsia="Calibri" w:hAnsi="Calibri"/>
+          <w:sz w:val="20"/>
+          <w:szCs w:val="20"/>
+        </w:rPr>
+        <w:t xml:space="preserve">El personal que ingrese a áreas de atención al público o de administración de recursos se capacita antes de iniciar funciones o al mismo tiempo (Art. 39 Bis 1, tercer párrafo). Las evaluaciones, constancias, listas de asistencia y medidas aplicadas se conservan por diez años (Documento D11-COR).</w:t>
+      </w:r>
+    </w:p>
+    <w:p>
+      <w:pPr>
+        <w:shd w:fill="1F3864" w:val="clear"/>
+        <w:spacing w:after="100" w:before="220"/>
+      </w:pPr>
+      <w:r>
+        <w:rPr>
+          <w:rFonts w:ascii="Calibri" w:cs="Calibri" w:eastAsia="Calibri" w:hAnsi="Calibri"/>
+          <w:b/>
+          <w:bCs/>
+          <w:color w:val="FFFFFF"/>
+          <w:sz w:val="22"/>
+          <w:szCs w:val="22"/>
+        </w:rPr>
+        <w:t xml:space="preserve">Capítulo 12: Auditoría</w:t>
+      </w:r>
+    </w:p>
+    <w:p>
+      <w:pPr>
+        <w:spacing w:after="110"/>
+      </w:pPr>
+      <w:r>
+        <w:rPr>
+          <w:rFonts w:ascii="Calibri" w:cs="Calibri" w:eastAsia="Calibri" w:hAnsi="Calibri"/>
+          <w:sz w:val="20"/>
+          <w:szCs w:val="20"/>
+        </w:rPr>
+        <w:t xml:space="preserve">La auditoría es anual, por año calendario (Art. 18, fr. XI, de la Ley; Arts. 42 a 51 RCG), y evalúa y dictamina la efectividad del cumplimiento de la Ley, su Reglamento y las RCG; el primer periodo es el año 2028. Cuando el Riesgo de la Correduría, determinado conforme a la sección 5.1, sea bajo o medio, puede realizarla un área de auditoría interna independiente o una persona auditora externa independiente; cuando sea alto, una persona auditora externa independiente con título y cédula en derecho, contaduría, finanzas, administración o informática, al menos tres años de experiencia en la materia y certificación vigente de la UIF. Si la Correduría no cuenta con un área de auditoría interna independiente del Corredor Público Titular, la revisión se encomienda a una persona auditora externa. El dictamen se presenta directamente al Corredor (Art. 42 RCG), se estructura en siete secciones y califica cada obligación como Cumple, Cumple mayoritariamente, Cumple parcialmente, No cumple o No aplica (Arts. 47 y 48 RCG). Formato: Documento D13-COR.</w:t>
+      </w:r>
+    </w:p>
+    <w:p>
+      <w:pPr>
+        <w:keepNext/>
+        <w:spacing w:after="60" w:before="120"/>
+      </w:pPr>
+      <w:r>
+        <w:rPr>
+          <w:rFonts w:ascii="Calibri" w:cs="Calibri" w:eastAsia="Calibri" w:hAnsi="Calibri"/>
+          <w:b/>
+          <w:bCs/>
+          <w:color w:val="0A1628"/>
+          <w:sz w:val="19"/>
+          <w:szCs w:val="19"/>
+        </w:rPr>
+        <w:t xml:space="preserve">12.1 Control interno y supervisión continua (Art. 37 Bis, fr. XII, RCG)</w:t>
+      </w:r>
+    </w:p>
+    <w:p>
+      <w:pPr>
+        <w:spacing w:after="110"/>
+      </w:pPr>
+      <w:r>
+        <w:rPr>
+          <w:rFonts w:ascii="Calibri" w:cs="Calibri" w:eastAsia="Calibri" w:hAnsi="Calibri"/>
+          <w:sz w:val="20"/>
+          <w:szCs w:val="20"/>
+        </w:rPr>
+        <w:t xml:space="preserve">Además de la auditoría anual, se aplican los siguientes controles:</w:t>
+      </w:r>
+    </w:p>
+    <w:p>
+      <w:pPr>
+        <w:pStyle w:val="ListParagraph"/>
+        <w:numPr>
+          <w:ilvl w:val="0"/>
+          <w:numId w:val="1"/>
+        </w:numPr>
+        <w:spacing w:after="40"/>
+      </w:pPr>
+      <w:r>
+        <w:rPr>
+          <w:rFonts w:ascii="Calibri" w:cs="Calibri" w:eastAsia="Calibri" w:hAnsi="Calibri"/>
+          <w:sz w:val="20"/>
+          <w:szCs w:val="20"/>
+        </w:rPr>
+        <w:t xml:space="preserve">Control preventivo: antes de formalizar cada acto u operación, el Corredor Público Titular — o la persona que designe — verifica con una lista de control que el expediente esté completo, el Grado de Riesgo asignado, las listas y la calidad de PEP consultadas, la forma de pago documentada y, en su caso, la aprobación o constancia de PEP de Riesgo alto.</w:t>
+      </w:r>
+    </w:p>
+    <w:p>
+      <w:pPr>
+        <w:pStyle w:val="ListParagraph"/>
+        <w:numPr>
+          <w:ilvl w:val="0"/>
+          <w:numId w:val="1"/>
+        </w:numPr>
+        <w:spacing w:after="40"/>
+      </w:pPr>
+      <w:r>
+        <w:rPr>
+          <w:rFonts w:ascii="Calibri" w:cs="Calibri" w:eastAsia="Calibri" w:hAnsi="Calibri"/>
+          <w:sz w:val="20"/>
+          <w:szCs w:val="20"/>
+        </w:rPr>
+        <w:t xml:space="preserve">Control de detección mensual: conciliación de actos u operaciones, Avisos e informes y acuses (Documento D12-COR); revisión de las alertas abiertas y de los Grados de Riesgo con reevaluación vencida.</w:t>
+      </w:r>
+    </w:p>
+    <w:p>
+      <w:pPr>
+        <w:pStyle w:val="ListParagraph"/>
+        <w:numPr>
+          <w:ilvl w:val="0"/>
+          <w:numId w:val="1"/>
+        </w:numPr>
+        <w:spacing w:after="40"/>
+      </w:pPr>
+      <w:r>
+        <w:rPr>
+          <w:rFonts w:ascii="Calibri" w:cs="Calibri" w:eastAsia="Calibri" w:hAnsi="Calibri"/>
+          <w:sz w:val="20"/>
+          <w:szCs w:val="20"/>
+        </w:rPr>
+        <w:t xml:space="preserve">Revisión trimestral: muestra de al menos el 10 % de los expedientes del trimestre (mínimo cinco), revisada por el Corredor Público Titular, sobre expedientes integrados por el personal, o un tercero independiente cuando el propio Corredor los haya integrado, con hallazgos y acciones correctivas (criterio del Programa).</w:t>
+      </w:r>
+    </w:p>
+    <w:p>
+      <w:pPr>
+        <w:pStyle w:val="ListParagraph"/>
+        <w:numPr>
+          <w:ilvl w:val="0"/>
+          <w:numId w:val="1"/>
+        </w:numPr>
+        <w:spacing w:after="40"/>
+      </w:pPr>
+      <w:r>
+        <w:rPr>
+          <w:rFonts w:ascii="Calibri" w:cs="Calibri" w:eastAsia="Calibri" w:hAnsi="Calibri"/>
+          <w:sz w:val="20"/>
+          <w:szCs w:val="20"/>
+        </w:rPr>
+        <w:t xml:space="preserve">Indicadores: porcentaje de expedientes completos, Avisos presentados en plazo, alertas atendidas en plazo y personal capacitado y acreditado.</w:t>
+      </w:r>
+    </w:p>
+    <w:p>
+      <w:pPr>
+        <w:pStyle w:val="ListParagraph"/>
+        <w:numPr>
+          <w:ilvl w:val="0"/>
+          <w:numId w:val="1"/>
+        </w:numPr>
+        <w:spacing w:after="40"/>
+      </w:pPr>
+      <w:r>
+        <w:rPr>
+          <w:rFonts w:ascii="Calibri" w:cs="Calibri" w:eastAsia="Calibri" w:hAnsi="Calibri"/>
+          <w:sz w:val="20"/>
+          <w:szCs w:val="20"/>
+        </w:rPr>
         <w:t xml:space="preserve">Informe: el Corredor Público Titular documenta semestralmente los resultados, hallazgos y acciones correctivas con responsable y fecha; el auditor revisa su seguimiento en la auditoría anual.</w:t>
+      </w:r>
+    </w:p>
+    <w:p>
+      <w:pPr>
+        <w:pStyle w:val="ListParagraph"/>
+        <w:numPr>
+          <w:ilvl w:val="0"/>
+          <w:numId w:val="1"/>
+        </w:numPr>
+        <w:spacing w:after="40"/>
+      </w:pPr>
+      <w:r>
+        <w:rPr>
+          <w:rFonts w:ascii="Calibri" w:cs="Calibri" w:eastAsia="Calibri" w:hAnsi="Calibri"/>
+          <w:sz w:val="20"/>
+          <w:szCs w:val="20"/>
+        </w:rPr>
+        <w:t xml:space="preserve">Plan de seguimiento de observaciones: cada hallazgo del dictamen de auditoría y de la supervisión interna se registra con su acción correctiva, responsable y fecha compromiso —no mayor a 90 días para los calificados "No cumple" y a 180 días para "Cumple parcialmente" (criterio del Programa)—. El Corredor Público Titular da seguimiento trimestral, documenta el cierre con evidencia y presenta el estatus al siguiente auditor (Art. 42 RCG, programas de acción correctiva).</w:t>
       </w:r>
     </w:p>
     <w:p>
@@ -4556,6 +5327,701 @@
           <w:szCs w:val="20"/>
         </w:rPr>
         <w:t xml:space="preserve">Cada alerta se registra con fecha, cliente, parámetro, análisis, decisión (descartada; Perfil actualizado; reclasificación del Grado de Riesgo; o análisis de Aviso) y responsable. Si una alerta no puede descartarse razonablemente, se analiza conforme al Documento D9-COR para determinar si procede el Aviso dentro de las 24 horas siguientes. Los registros se conservan diez años e integran los mecanismos automatizados.</w:t>
+      </w:r>
+    </w:p>
+    <w:p>
+      <w:pPr>
+        <w:keepNext/>
+        <w:spacing w:after="60" w:before="120"/>
+      </w:pPr>
+      <w:r>
+        <w:rPr>
+          <w:rFonts w:ascii="Calibri" w:cs="Calibri" w:eastAsia="Calibri" w:hAnsi="Calibri"/>
+          <w:b/>
+          <w:bCs/>
+          <w:color w:val="0A1628"/>
+          <w:sz w:val="19"/>
+          <w:szCs w:val="19"/>
+        </w:rPr>
+        <w:t xml:space="preserve">13.2 Procedimiento interno de análisis y dictamen de alertas</w:t>
+      </w:r>
+    </w:p>
+    <w:p>
+      <w:pPr>
+        <w:spacing w:after="110"/>
+      </w:pPr>
+      <w:r>
+        <w:rPr>
+          <w:rFonts w:ascii="Calibri" w:cs="Calibri" w:eastAsia="Calibri" w:hAnsi="Calibri"/>
+          <w:sz w:val="20"/>
+          <w:szCs w:val="20"/>
+        </w:rPr>
+        <w:t xml:space="preserve">Toda alerta —por desviación del Perfil Transaccional, señal de alerta, coincidencia en listas o PEP, o jurisdicción de Riesgo— sigue este flujo. Los plazos internos son criterio del Programa; el plazo de 24 horas es legal.</w:t>
+      </w:r>
+    </w:p>
+    <w:tbl>
+      <w:tblPr>
+        <w:tblW w:type="dxa" w:w="9500"/>
+        <w:tblBorders>
+          <w:top w:val="single" w:color="auto" w:sz="4"/>
+          <w:left w:val="single" w:color="auto" w:sz="4"/>
+          <w:bottom w:val="single" w:color="auto" w:sz="4"/>
+          <w:right w:val="single" w:color="auto" w:sz="4"/>
+          <w:insideH w:val="single" w:color="auto" w:sz="4"/>
+          <w:insideV w:val="single" w:color="auto" w:sz="4"/>
+        </w:tblBorders>
+        <w:tblLayout w:type="fixed"/>
+      </w:tblPr>
+      <w:tblGrid>
+        <w:gridCol w:w="2300"/>
+        <w:gridCol w:w="4600"/>
+        <w:gridCol w:w="2600"/>
+      </w:tblGrid>
+      <w:tr>
+        <w:trPr>
+          <w:tblHeader/>
+        </w:trPr>
+        <w:tc>
+          <w:tcPr>
+            <w:tcW w:type="dxa" w:w="2300"/>
+            <w:shd w:fill="1F3864" w:val="clear"/>
+            <w:tcMar>
+              <w:top w:type="dxa" w:w="60"/>
+              <w:left w:type="dxa" w:w="100"/>
+              <w:bottom w:type="dxa" w:w="60"/>
+              <w:right w:type="dxa" w:w="100"/>
+            </w:tcMar>
+          </w:tcPr>
+          <w:p>
+            <w:pPr>
+              <w:spacing w:after="0"/>
+            </w:pPr>
+            <w:r>
+              <w:rPr>
+                <w:rFonts w:ascii="Calibri" w:cs="Calibri" w:eastAsia="Calibri" w:hAnsi="Calibri"/>
+                <w:b/>
+                <w:bCs/>
+                <w:color w:val="FFFFFF"/>
+                <w:sz w:val="18"/>
+                <w:szCs w:val="18"/>
+              </w:rPr>
+              <w:t xml:space="preserve">Etapa</w:t>
+            </w:r>
+          </w:p>
+        </w:tc>
+        <w:tc>
+          <w:tcPr>
+            <w:tcW w:type="dxa" w:w="4600"/>
+            <w:shd w:fill="1F3864" w:val="clear"/>
+            <w:tcMar>
+              <w:top w:type="dxa" w:w="60"/>
+              <w:left w:type="dxa" w:w="100"/>
+              <w:bottom w:type="dxa" w:w="60"/>
+              <w:right w:type="dxa" w:w="100"/>
+            </w:tcMar>
+          </w:tcPr>
+          <w:p>
+            <w:pPr>
+              <w:spacing w:after="0"/>
+            </w:pPr>
+            <w:r>
+              <w:rPr>
+                <w:rFonts w:ascii="Calibri" w:cs="Calibri" w:eastAsia="Calibri" w:hAnsi="Calibri"/>
+                <w:b/>
+                <w:bCs/>
+                <w:color w:val="FFFFFF"/>
+                <w:sz w:val="18"/>
+                <w:szCs w:val="18"/>
+              </w:rPr>
+              <w:t xml:space="preserve">Actividad</w:t>
+            </w:r>
+          </w:p>
+        </w:tc>
+        <w:tc>
+          <w:tcPr>
+            <w:tcW w:type="dxa" w:w="2600"/>
+            <w:shd w:fill="1F3864" w:val="clear"/>
+            <w:tcMar>
+              <w:top w:type="dxa" w:w="60"/>
+              <w:left w:type="dxa" w:w="100"/>
+              <w:bottom w:type="dxa" w:w="60"/>
+              <w:right w:type="dxa" w:w="100"/>
+            </w:tcMar>
+          </w:tcPr>
+          <w:p>
+            <w:pPr>
+              <w:spacing w:after="0"/>
+            </w:pPr>
+            <w:r>
+              <w:rPr>
+                <w:rFonts w:ascii="Calibri" w:cs="Calibri" w:eastAsia="Calibri" w:hAnsi="Calibri"/>
+                <w:b/>
+                <w:bCs/>
+                <w:color w:val="FFFFFF"/>
+                <w:sz w:val="18"/>
+                <w:szCs w:val="18"/>
+              </w:rPr>
+              <w:t xml:space="preserve">Plazo</w:t>
+            </w:r>
+          </w:p>
+        </w:tc>
+      </w:tr>
+      <w:tr>
+        <w:trPr>
+          <w:cantSplit/>
+        </w:trPr>
+        <w:tc>
+          <w:tcPr>
+            <w:tcW w:type="dxa" w:w="2300"/>
+            <w:tcMar>
+              <w:top w:type="dxa" w:w="60"/>
+              <w:left w:type="dxa" w:w="100"/>
+              <w:bottom w:type="dxa" w:w="60"/>
+              <w:right w:type="dxa" w:w="100"/>
+            </w:tcMar>
+          </w:tcPr>
+          <w:p>
+            <w:pPr>
+              <w:spacing w:after="0"/>
+            </w:pPr>
+            <w:r>
+              <w:rPr>
+                <w:rFonts w:ascii="Calibri" w:cs="Calibri" w:eastAsia="Calibri" w:hAnsi="Calibri"/>
+                <w:sz w:val="18"/>
+                <w:szCs w:val="18"/>
+              </w:rPr>
+              <w:t xml:space="preserve">1. Registro</w:t>
+            </w:r>
+          </w:p>
+        </w:tc>
+        <w:tc>
+          <w:tcPr>
+            <w:tcW w:type="dxa" w:w="4600"/>
+            <w:tcMar>
+              <w:top w:type="dxa" w:w="60"/>
+              <w:left w:type="dxa" w:w="100"/>
+              <w:bottom w:type="dxa" w:w="60"/>
+              <w:right w:type="dxa" w:w="100"/>
+            </w:tcMar>
+          </w:tcPr>
+          <w:p>
+            <w:pPr>
+              <w:spacing w:after="0"/>
+            </w:pPr>
+            <w:r>
+              <w:rPr>
+                <w:rFonts w:ascii="Calibri" w:cs="Calibri" w:eastAsia="Calibri" w:hAnsi="Calibri"/>
+                <w:sz w:val="18"/>
+                <w:szCs w:val="18"/>
+              </w:rPr>
+              <w:t xml:space="preserve">Se registra la alerta con fecha, cliente, origen y parámetro activado.</w:t>
+            </w:r>
+          </w:p>
+        </w:tc>
+        <w:tc>
+          <w:tcPr>
+            <w:tcW w:type="dxa" w:w="2600"/>
+            <w:tcMar>
+              <w:top w:type="dxa" w:w="60"/>
+              <w:left w:type="dxa" w:w="100"/>
+              <w:bottom w:type="dxa" w:w="60"/>
+              <w:right w:type="dxa" w:w="100"/>
+            </w:tcMar>
+          </w:tcPr>
+          <w:p>
+            <w:pPr>
+              <w:spacing w:after="0"/>
+            </w:pPr>
+            <w:r>
+              <w:rPr>
+                <w:rFonts w:ascii="Calibri" w:cs="Calibri" w:eastAsia="Calibri" w:hAnsi="Calibri"/>
+                <w:sz w:val="18"/>
+                <w:szCs w:val="18"/>
+              </w:rPr>
+              <w:t xml:space="preserve">El mismo día en que se genera</w:t>
+            </w:r>
+          </w:p>
+        </w:tc>
+      </w:tr>
+      <w:tr>
+        <w:trPr>
+          <w:cantSplit/>
+        </w:trPr>
+        <w:tc>
+          <w:tcPr>
+            <w:tcW w:type="dxa" w:w="2300"/>
+            <w:tcMar>
+              <w:top w:type="dxa" w:w="60"/>
+              <w:left w:type="dxa" w:w="100"/>
+              <w:bottom w:type="dxa" w:w="60"/>
+              <w:right w:type="dxa" w:w="100"/>
+            </w:tcMar>
+          </w:tcPr>
+          <w:p>
+            <w:pPr>
+              <w:spacing w:after="0"/>
+            </w:pPr>
+            <w:r>
+              <w:rPr>
+                <w:rFonts w:ascii="Calibri" w:cs="Calibri" w:eastAsia="Calibri" w:hAnsi="Calibri"/>
+                <w:sz w:val="18"/>
+                <w:szCs w:val="18"/>
+              </w:rPr>
+              <w:t xml:space="preserve">2. Análisis preliminar</w:t>
+            </w:r>
+          </w:p>
+        </w:tc>
+        <w:tc>
+          <w:tcPr>
+            <w:tcW w:type="dxa" w:w="4600"/>
+            <w:tcMar>
+              <w:top w:type="dxa" w:w="60"/>
+              <w:left w:type="dxa" w:w="100"/>
+              <w:bottom w:type="dxa" w:w="60"/>
+              <w:right w:type="dxa" w:w="100"/>
+            </w:tcMar>
+          </w:tcPr>
+          <w:p>
+            <w:pPr>
+              <w:spacing w:after="0"/>
+            </w:pPr>
+            <w:r>
+              <w:rPr>
+                <w:rFonts w:ascii="Calibri" w:cs="Calibri" w:eastAsia="Calibri" w:hAnsi="Calibri"/>
+                <w:sz w:val="18"/>
+                <w:szCs w:val="18"/>
+              </w:rPr>
+              <w:t xml:space="preserve">Se revisan el expediente, el Perfil Transaccional y el historial. Si hace falta información del cliente, se solicita como actualización ordinaria del expediente, sin revelar la existencia de la alerta (Capítulo 16).</w:t>
+            </w:r>
+          </w:p>
+        </w:tc>
+        <w:tc>
+          <w:tcPr>
+            <w:tcW w:type="dxa" w:w="2600"/>
+            <w:tcMar>
+              <w:top w:type="dxa" w:w="60"/>
+              <w:left w:type="dxa" w:w="100"/>
+              <w:bottom w:type="dxa" w:w="60"/>
+              <w:right w:type="dxa" w:w="100"/>
+            </w:tcMar>
+          </w:tcPr>
+          <w:p>
+            <w:pPr>
+              <w:spacing w:after="0"/>
+            </w:pPr>
+            <w:r>
+              <w:rPr>
+                <w:rFonts w:ascii="Calibri" w:cs="Calibri" w:eastAsia="Calibri" w:hAnsi="Calibri"/>
+                <w:sz w:val="18"/>
+                <w:szCs w:val="18"/>
+              </w:rPr>
+              <w:t xml:space="preserve">≤ 2 días hábiles</w:t>
+            </w:r>
+          </w:p>
+        </w:tc>
+      </w:tr>
+      <w:tr>
+        <w:trPr>
+          <w:cantSplit/>
+        </w:trPr>
+        <w:tc>
+          <w:tcPr>
+            <w:tcW w:type="dxa" w:w="2300"/>
+            <w:tcMar>
+              <w:top w:type="dxa" w:w="60"/>
+              <w:left w:type="dxa" w:w="100"/>
+              <w:bottom w:type="dxa" w:w="60"/>
+              <w:right w:type="dxa" w:w="100"/>
+            </w:tcMar>
+          </w:tcPr>
+          <w:p>
+            <w:pPr>
+              <w:spacing w:after="0"/>
+            </w:pPr>
+            <w:r>
+              <w:rPr>
+                <w:rFonts w:ascii="Calibri" w:cs="Calibri" w:eastAsia="Calibri" w:hAnsi="Calibri"/>
+                <w:sz w:val="18"/>
+                <w:szCs w:val="18"/>
+              </w:rPr>
+              <w:t xml:space="preserve">3. Escalamiento</w:t>
+            </w:r>
+          </w:p>
+        </w:tc>
+        <w:tc>
+          <w:tcPr>
+            <w:tcW w:type="dxa" w:w="4600"/>
+            <w:tcMar>
+              <w:top w:type="dxa" w:w="60"/>
+              <w:left w:type="dxa" w:w="100"/>
+              <w:bottom w:type="dxa" w:w="60"/>
+              <w:right w:type="dxa" w:w="100"/>
+            </w:tcMar>
+          </w:tcPr>
+          <w:p>
+            <w:pPr>
+              <w:spacing w:after="0"/>
+            </w:pPr>
+            <w:r>
+              <w:rPr>
+                <w:rFonts w:ascii="Calibri" w:cs="Calibri" w:eastAsia="Calibri" w:hAnsi="Calibri"/>
+                <w:sz w:val="18"/>
+                <w:szCs w:val="18"/>
+              </w:rPr>
+              <w:t xml:space="preserve">Si la alerta no se descarta, se escala al Corredor Público Titular. Las alertas de listas, PEP de Riesgo alto o jurisdicciones de Riesgo se escalan de inmediato.</w:t>
+            </w:r>
+          </w:p>
+        </w:tc>
+        <w:tc>
+          <w:tcPr>
+            <w:tcW w:type="dxa" w:w="2600"/>
+            <w:tcMar>
+              <w:top w:type="dxa" w:w="60"/>
+              <w:left w:type="dxa" w:w="100"/>
+              <w:bottom w:type="dxa" w:w="60"/>
+              <w:right w:type="dxa" w:w="100"/>
+            </w:tcMar>
+          </w:tcPr>
+          <w:p>
+            <w:pPr>
+              <w:spacing w:after="0"/>
+            </w:pPr>
+            <w:r>
+              <w:rPr>
+                <w:rFonts w:ascii="Calibri" w:cs="Calibri" w:eastAsia="Calibri" w:hAnsi="Calibri"/>
+                <w:sz w:val="18"/>
+                <w:szCs w:val="18"/>
+              </w:rPr>
+              <w:t xml:space="preserve">Inmediato al concluir la etapa 2</w:t>
+            </w:r>
+          </w:p>
+        </w:tc>
+      </w:tr>
+      <w:tr>
+        <w:trPr>
+          <w:cantSplit/>
+        </w:trPr>
+        <w:tc>
+          <w:tcPr>
+            <w:tcW w:type="dxa" w:w="2300"/>
+            <w:tcMar>
+              <w:top w:type="dxa" w:w="60"/>
+              <w:left w:type="dxa" w:w="100"/>
+              <w:bottom w:type="dxa" w:w="60"/>
+              <w:right w:type="dxa" w:w="100"/>
+            </w:tcMar>
+          </w:tcPr>
+          <w:p>
+            <w:pPr>
+              <w:spacing w:after="0"/>
+            </w:pPr>
+            <w:r>
+              <w:rPr>
+                <w:rFonts w:ascii="Calibri" w:cs="Calibri" w:eastAsia="Calibri" w:hAnsi="Calibri"/>
+                <w:sz w:val="18"/>
+                <w:szCs w:val="18"/>
+              </w:rPr>
+              <w:t xml:space="preserve">4. Dictamen</w:t>
+            </w:r>
+          </w:p>
+        </w:tc>
+        <w:tc>
+          <w:tcPr>
+            <w:tcW w:type="dxa" w:w="4600"/>
+            <w:tcMar>
+              <w:top w:type="dxa" w:w="60"/>
+              <w:left w:type="dxa" w:w="100"/>
+              <w:bottom w:type="dxa" w:w="60"/>
+              <w:right w:type="dxa" w:w="100"/>
+            </w:tcMar>
+          </w:tcPr>
+          <w:p>
+            <w:pPr>
+              <w:spacing w:after="0"/>
+            </w:pPr>
+            <w:r>
+              <w:rPr>
+                <w:rFonts w:ascii="Calibri" w:cs="Calibri" w:eastAsia="Calibri" w:hAnsi="Calibri"/>
+                <w:sz w:val="18"/>
+                <w:szCs w:val="18"/>
+              </w:rPr>
+              <w:t xml:space="preserve">Conclusión escrita y motivada: (a) descartada; (b) inusual sin elementos de sospecha → actualizar el Perfil y aplicar monitoreo reforzado; (c) sospechosa → Aviso por sospecha; (d) coincidencia confirmada en listas → abstención y Aviso.</w:t>
+            </w:r>
+          </w:p>
+        </w:tc>
+        <w:tc>
+          <w:tcPr>
+            <w:tcW w:type="dxa" w:w="2600"/>
+            <w:tcMar>
+              <w:top w:type="dxa" w:w="60"/>
+              <w:left w:type="dxa" w:w="100"/>
+              <w:bottom w:type="dxa" w:w="60"/>
+              <w:right w:type="dxa" w:w="100"/>
+            </w:tcMar>
+          </w:tcPr>
+          <w:p>
+            <w:pPr>
+              <w:spacing w:after="0"/>
+            </w:pPr>
+            <w:r>
+              <w:rPr>
+                <w:rFonts w:ascii="Calibri" w:cs="Calibri" w:eastAsia="Calibri" w:hAnsi="Calibri"/>
+                <w:sz w:val="18"/>
+                <w:szCs w:val="18"/>
+              </w:rPr>
+              <w:t xml:space="preserve">≤ 5 días hábiles desde la alerta</w:t>
+            </w:r>
+          </w:p>
+        </w:tc>
+      </w:tr>
+      <w:tr>
+        <w:trPr>
+          <w:cantSplit/>
+        </w:trPr>
+        <w:tc>
+          <w:tcPr>
+            <w:tcW w:type="dxa" w:w="2300"/>
+            <w:tcMar>
+              <w:top w:type="dxa" w:w="60"/>
+              <w:left w:type="dxa" w:w="100"/>
+              <w:bottom w:type="dxa" w:w="60"/>
+              <w:right w:type="dxa" w:w="100"/>
+            </w:tcMar>
+          </w:tcPr>
+          <w:p>
+            <w:pPr>
+              <w:spacing w:after="0"/>
+            </w:pPr>
+            <w:r>
+              <w:rPr>
+                <w:rFonts w:ascii="Calibri" w:cs="Calibri" w:eastAsia="Calibri" w:hAnsi="Calibri"/>
+                <w:sz w:val="18"/>
+                <w:szCs w:val="18"/>
+              </w:rPr>
+              <w:t xml:space="preserve">5. Aviso de 24 horas</w:t>
+            </w:r>
+          </w:p>
+        </w:tc>
+        <w:tc>
+          <w:tcPr>
+            <w:tcW w:type="dxa" w:w="4600"/>
+            <w:tcMar>
+              <w:top w:type="dxa" w:w="60"/>
+              <w:left w:type="dxa" w:w="100"/>
+              <w:bottom w:type="dxa" w:w="60"/>
+              <w:right w:type="dxa" w:w="100"/>
+            </w:tcMar>
+          </w:tcPr>
+          <w:p>
+            <w:pPr>
+              <w:spacing w:after="0"/>
+            </w:pPr>
+            <w:r>
+              <w:rPr>
+                <w:rFonts w:ascii="Calibri" w:cs="Calibri" w:eastAsia="Calibri" w:hAnsi="Calibri"/>
+                <w:sz w:val="18"/>
+                <w:szCs w:val="18"/>
+              </w:rPr>
+              <w:t xml:space="preserve">En los casos (c) y (d), el Aviso se presenta dentro de las 24 horas siguientes a que se reconoció la conducta inusitada o el indicio (Arts. 26 Bis, 26 Bis 1 y 27 RCG), aunque el acto no se haya celebrado o no alcance el umbral. Formato: Documento D9-COR.</w:t>
+            </w:r>
+          </w:p>
+        </w:tc>
+        <w:tc>
+          <w:tcPr>
+            <w:tcW w:type="dxa" w:w="2600"/>
+            <w:tcMar>
+              <w:top w:type="dxa" w:w="60"/>
+              <w:left w:type="dxa" w:w="100"/>
+              <w:bottom w:type="dxa" w:w="60"/>
+              <w:right w:type="dxa" w:w="100"/>
+            </w:tcMar>
+          </w:tcPr>
+          <w:p>
+            <w:pPr>
+              <w:spacing w:after="0"/>
+            </w:pPr>
+            <w:r>
+              <w:rPr>
+                <w:rFonts w:ascii="Calibri" w:cs="Calibri" w:eastAsia="Calibri" w:hAnsi="Calibri"/>
+                <w:sz w:val="18"/>
+                <w:szCs w:val="18"/>
+              </w:rPr>
+              <w:t xml:space="preserve">24 horas (plazo legal)</w:t>
+            </w:r>
+          </w:p>
+        </w:tc>
+      </w:tr>
+      <w:tr>
+        <w:trPr>
+          <w:cantSplit/>
+        </w:trPr>
+        <w:tc>
+          <w:tcPr>
+            <w:tcW w:type="dxa" w:w="2300"/>
+            <w:tcMar>
+              <w:top w:type="dxa" w:w="60"/>
+              <w:left w:type="dxa" w:w="100"/>
+              <w:bottom w:type="dxa" w:w="60"/>
+              <w:right w:type="dxa" w:w="100"/>
+            </w:tcMar>
+          </w:tcPr>
+          <w:p>
+            <w:pPr>
+              <w:spacing w:after="0"/>
+            </w:pPr>
+            <w:r>
+              <w:rPr>
+                <w:rFonts w:ascii="Calibri" w:cs="Calibri" w:eastAsia="Calibri" w:hAnsi="Calibri"/>
+                <w:sz w:val="18"/>
+                <w:szCs w:val="18"/>
+              </w:rPr>
+              <w:t xml:space="preserve">6. Decisión sobre la relación</w:t>
+            </w:r>
+          </w:p>
+        </w:tc>
+        <w:tc>
+          <w:tcPr>
+            <w:tcW w:type="dxa" w:w="4600"/>
+            <w:tcMar>
+              <w:top w:type="dxa" w:w="60"/>
+              <w:left w:type="dxa" w:w="100"/>
+              <w:bottom w:type="dxa" w:w="60"/>
+              <w:right w:type="dxa" w:w="100"/>
+            </w:tcMar>
+          </w:tcPr>
+          <w:p>
+            <w:pPr>
+              <w:spacing w:after="0"/>
+            </w:pPr>
+            <w:r>
+              <w:rPr>
+                <w:rFonts w:ascii="Calibri" w:cs="Calibri" w:eastAsia="Calibri" w:hAnsi="Calibri"/>
+                <w:sz w:val="18"/>
+                <w:szCs w:val="18"/>
+              </w:rPr>
+              <w:t xml:space="preserve">Continuar, limitar o terminar la relación conforme a los criterios de apertura, limitación y terminación de este Manual.</w:t>
+            </w:r>
+          </w:p>
+        </w:tc>
+        <w:tc>
+          <w:tcPr>
+            <w:tcW w:type="dxa" w:w="2600"/>
+            <w:tcMar>
+              <w:top w:type="dxa" w:w="60"/>
+              <w:left w:type="dxa" w:w="100"/>
+              <w:bottom w:type="dxa" w:w="60"/>
+              <w:right w:type="dxa" w:w="100"/>
+            </w:tcMar>
+          </w:tcPr>
+          <w:p>
+            <w:pPr>
+              <w:spacing w:after="0"/>
+            </w:pPr>
+            <w:r>
+              <w:rPr>
+                <w:rFonts w:ascii="Calibri" w:cs="Calibri" w:eastAsia="Calibri" w:hAnsi="Calibri"/>
+                <w:sz w:val="18"/>
+                <w:szCs w:val="18"/>
+              </w:rPr>
+              <w:t xml:space="preserve">Junto con el dictamen</w:t>
+            </w:r>
+          </w:p>
+        </w:tc>
+      </w:tr>
+      <w:tr>
+        <w:trPr>
+          <w:cantSplit/>
+        </w:trPr>
+        <w:tc>
+          <w:tcPr>
+            <w:tcW w:type="dxa" w:w="2300"/>
+            <w:tcMar>
+              <w:top w:type="dxa" w:w="60"/>
+              <w:left w:type="dxa" w:w="100"/>
+              <w:bottom w:type="dxa" w:w="60"/>
+              <w:right w:type="dxa" w:w="100"/>
+            </w:tcMar>
+          </w:tcPr>
+          <w:p>
+            <w:pPr>
+              <w:spacing w:after="0"/>
+            </w:pPr>
+            <w:r>
+              <w:rPr>
+                <w:rFonts w:ascii="Calibri" w:cs="Calibri" w:eastAsia="Calibri" w:hAnsi="Calibri"/>
+                <w:sz w:val="18"/>
+                <w:szCs w:val="18"/>
+              </w:rPr>
+              <w:t xml:space="preserve">7. Conservación</w:t>
+            </w:r>
+          </w:p>
+        </w:tc>
+        <w:tc>
+          <w:tcPr>
+            <w:tcW w:type="dxa" w:w="4600"/>
+            <w:tcMar>
+              <w:top w:type="dxa" w:w="60"/>
+              <w:left w:type="dxa" w:w="100"/>
+              <w:bottom w:type="dxa" w:w="60"/>
+              <w:right w:type="dxa" w:w="100"/>
+            </w:tcMar>
+          </w:tcPr>
+          <w:p>
+            <w:pPr>
+              <w:spacing w:after="0"/>
+            </w:pPr>
+            <w:r>
+              <w:rPr>
+                <w:rFonts w:ascii="Calibri" w:cs="Calibri" w:eastAsia="Calibri" w:hAnsi="Calibri"/>
+                <w:sz w:val="18"/>
+                <w:szCs w:val="18"/>
+              </w:rPr>
+              <w:t xml:space="preserve">El registro, análisis, dictamen y evidencia se conservan diez años bajo confidencialidad.</w:t>
+            </w:r>
+          </w:p>
+        </w:tc>
+        <w:tc>
+          <w:tcPr>
+            <w:tcW w:type="dxa" w:w="2600"/>
+            <w:tcMar>
+              <w:top w:type="dxa" w:w="60"/>
+              <w:left w:type="dxa" w:w="100"/>
+              <w:bottom w:type="dxa" w:w="60"/>
+              <w:right w:type="dxa" w:w="100"/>
+            </w:tcMar>
+          </w:tcPr>
+          <w:p>
+            <w:pPr>
+              <w:spacing w:after="0"/>
+            </w:pPr>
+            <w:r>
+              <w:rPr>
+                <w:rFonts w:ascii="Calibri" w:cs="Calibri" w:eastAsia="Calibri" w:hAnsi="Calibri"/>
+                <w:sz w:val="18"/>
+                <w:szCs w:val="18"/>
+              </w:rPr>
+              <w:t xml:space="preserve">Permanente</w:t>
+            </w:r>
+          </w:p>
+        </w:tc>
+      </w:tr>
+    </w:tbl>
+    <w:p>
+      <w:pPr>
+        <w:spacing w:after="80"/>
+      </w:pPr>
+    </w:p>
+    <w:p>
+      <w:pPr>
+        <w:spacing w:after="110"/>
+      </w:pPr>
+      <w:r>
+        <w:rPr>
+          <w:rFonts w:ascii="Calibri" w:cs="Calibri" w:eastAsia="Calibri" w:hAnsi="Calibri"/>
+          <w:sz w:val="20"/>
+          <w:szCs w:val="20"/>
+        </w:rPr>
+        <w:t xml:space="preserve">El análisis no puede usarse para diferir el Aviso: en cuanto se reconoce la conducta inusitada o el indicio, corre el plazo de 24 horas. En el régimen de la LFPIORPI, los actos que alcanzan el umbral se reportan mediante el Aviso mensual ordinario, con independencia de este procedimiento.</w:t>
       </w:r>
     </w:p>
     <w:p>
@@ -5679,7 +7145,7 @@
                 <w:sz w:val="18"/>
                 <w:szCs w:val="18"/>
               </w:rPr>
-              <w:t xml:space="preserve">Caps. 4, 6 y 17</w:t>
+              <w:t xml:space="preserve">Caps. 4, 4.2, 6 y 17</w:t>
             </w:r>
           </w:p>
         </w:tc>
@@ -5881,7 +7347,7 @@
                 <w:sz w:val="18"/>
                 <w:szCs w:val="18"/>
               </w:rPr>
-              <w:t xml:space="preserve">Caps. 5, 5.2 y 5.3; Anexo B</w:t>
+              <w:t xml:space="preserve">Caps. 5, 5.2 a 5.4; Anexo B</w:t>
             </w:r>
           </w:p>
         </w:tc>
@@ -6083,7 +7549,7 @@
                 <w:sz w:val="18"/>
                 <w:szCs w:val="18"/>
               </w:rPr>
-              <w:t xml:space="preserve">Caps. 13 y 13.1</w:t>
+              <w:t xml:space="preserve">Caps. 13, 13.1 y 13.2</w:t>
             </w:r>
           </w:p>
         </w:tc>

</xml_diff>